<commit_message>
Complete risk management section
</commit_message>
<xml_diff>
--- a/SC Chapter 1.docx
+++ b/SC Chapter 1.docx
@@ -28,59 +28,6 @@
           <w:sz w:val="40"/>
         </w:rPr>
       </w:pPr>
-      <w:r>
-        <w:rPr>
-          <w:noProof/>
-        </w:rPr>
-        <w:drawing>
-          <wp:inline distT="0" distB="0" distL="0" distR="0" wp14:anchorId="3AF8ED67" wp14:editId="7950FAC8">
-            <wp:extent cx="2860675" cy="2860675"/>
-            <wp:effectExtent l="0" t="0" r="0" b="0"/>
-            <wp:docPr id="1644776032" name="Picture 1" descr="Department of Physics, QAU"/>
-            <wp:cNvGraphicFramePr>
-              <a:graphicFrameLocks xmlns:a="http://schemas.openxmlformats.org/drawingml/2006/main" noChangeAspect="1"/>
-            </wp:cNvGraphicFramePr>
-            <a:graphic xmlns:a="http://schemas.openxmlformats.org/drawingml/2006/main">
-              <a:graphicData uri="http://schemas.openxmlformats.org/drawingml/2006/picture">
-                <pic:pic xmlns:pic="http://schemas.openxmlformats.org/drawingml/2006/picture">
-                  <pic:nvPicPr>
-                    <pic:cNvPr id="0" name="Picture 1" descr="Department of Physics, QAU"/>
-                    <pic:cNvPicPr>
-                      <a:picLocks noChangeAspect="1" noChangeArrowheads="1"/>
-                    </pic:cNvPicPr>
-                  </pic:nvPicPr>
-                  <pic:blipFill>
-                    <a:blip r:embed="rId5">
-                      <a:extLst>
-                        <a:ext uri="{28A0092B-C50C-407E-A947-70E740481C1C}">
-                          <a14:useLocalDpi xmlns:a14="http://schemas.microsoft.com/office/drawing/2010/main" val="0"/>
-                        </a:ext>
-                      </a:extLst>
-                    </a:blip>
-                    <a:srcRect/>
-                    <a:stretch>
-                      <a:fillRect/>
-                    </a:stretch>
-                  </pic:blipFill>
-                  <pic:spPr bwMode="auto">
-                    <a:xfrm>
-                      <a:off x="0" y="0"/>
-                      <a:ext cx="2860675" cy="2860675"/>
-                    </a:xfrm>
-                    <a:prstGeom prst="rect">
-                      <a:avLst/>
-                    </a:prstGeom>
-                    <a:noFill/>
-                    <a:ln>
-                      <a:noFill/>
-                    </a:ln>
-                  </pic:spPr>
-                </pic:pic>
-              </a:graphicData>
-            </a:graphic>
-          </wp:inline>
-        </w:drawing>
-      </w:r>
     </w:p>
     <w:p>
       <w:pPr>
@@ -117,15 +64,6 @@
           <w:sz w:val="40"/>
         </w:rPr>
       </w:pPr>
-    </w:p>
-    <w:p>
-      <w:pPr>
-        <w:jc w:val="center"/>
-        <w:rPr>
-          <w:b/>
-          <w:sz w:val="40"/>
-        </w:rPr>
-      </w:pPr>
       <w:r>
         <w:rPr>
           <w:b/>
@@ -158,20 +96,7 @@
         <w:jc w:val="center"/>
       </w:pPr>
       <w:r>
-        <w:rPr>
-          <w:b/>
-        </w:rPr>
-        <w:t xml:space="preserve">Prepared by: Zohaib Zafar </w:t>
-      </w:r>
-      <w:r>
-        <w:rPr>
-          <w:b/>
-        </w:rPr>
-        <w:br/>
-      </w:r>
-      <w:r>
-        <w:br/>
-        <w:t>Date: 17-Sep-2026</w:t>
+        <w:t>Prepared by: Zohaib Zafar, Aftab Shaban &amp; Bahlol</w:t>
       </w:r>
     </w:p>
     <w:p>
@@ -182,586 +107,1668 @@
     <w:p>
       <w:pPr>
         <w:spacing w:after="240"/>
-      </w:pPr>
-      <w:r>
         <w:rPr>
           <w:b/>
           <w:color w:val="0F4761"/>
           <w:sz w:val="40"/>
         </w:rPr>
+      </w:pPr>
+    </w:p>
+    <w:p>
+      <w:pPr>
+        <w:spacing w:after="240"/>
+        <w:rPr>
+          <w:b/>
+          <w:color w:val="0F4761"/>
+          <w:sz w:val="40"/>
+        </w:rPr>
+      </w:pPr>
+    </w:p>
+    <w:p>
+      <w:pPr>
+        <w:spacing w:after="240"/>
+      </w:pPr>
+      <w:r>
+        <w:rPr>
+          <w:b/>
+          <w:color w:val="0F4761"/>
+          <w:sz w:val="40"/>
+        </w:rPr>
+        <w:t>Table of Contents</w:t>
+      </w:r>
+    </w:p>
+    <w:p>
+      <w:pPr>
+        <w:pStyle w:val="TOC1"/>
+      </w:pPr>
+      <w:r>
+        <w:fldChar w:fldCharType="begin"/>
+      </w:r>
+      <w:r>
+        <w:instrText xml:space="preserve"> TOC \o "1-2" \h \z \u </w:instrText>
+      </w:r>
+      <w:r>
+        <w:fldChar w:fldCharType="separate"/>
+      </w:r>
+      <w:hyperlink w:anchor="_Toc100001" w:history="1">
+        <w:r>
+          <w:t>1. Project Overview</w:t>
+        </w:r>
+        <w:r>
+          <w:tab/>
+        </w:r>
+        <w:r>
+          <w:fldChar w:fldCharType="begin"/>
+        </w:r>
+        <w:r>
+          <w:instrText xml:space="preserve"> PAGEREF _Toc100001 \h </w:instrText>
+        </w:r>
+        <w:r>
+          <w:fldChar w:fldCharType="separate"/>
+        </w:r>
+        <w:r>
+          <w:t>3</w:t>
+        </w:r>
+        <w:r>
+          <w:fldChar w:fldCharType="end"/>
+        </w:r>
+      </w:hyperlink>
+    </w:p>
+    <w:p>
+      <w:pPr>
+        <w:pStyle w:val="TOC2"/>
+      </w:pPr>
+      <w:hyperlink w:anchor="_Toc100002" w:history="1">
+        <w:r>
+          <w:t>1.1 Project Summary</w:t>
+        </w:r>
+        <w:r>
+          <w:tab/>
+        </w:r>
+        <w:r>
+          <w:fldChar w:fldCharType="begin"/>
+        </w:r>
+        <w:r>
+          <w:instrText xml:space="preserve"> PAGEREF _Toc100002 \h </w:instrText>
+        </w:r>
+        <w:r>
+          <w:fldChar w:fldCharType="separate"/>
+        </w:r>
+        <w:r>
+          <w:t>3</w:t>
+        </w:r>
+        <w:r>
+          <w:fldChar w:fldCharType="end"/>
+        </w:r>
+      </w:hyperlink>
+    </w:p>
+    <w:p>
+      <w:pPr>
+        <w:pStyle w:val="TOC2"/>
+      </w:pPr>
+      <w:hyperlink w:anchor="_Toc100003" w:history="1">
+        <w:r>
+          <w:t>1.2 Purpose, Scope and Objectives</w:t>
+        </w:r>
+        <w:r>
+          <w:tab/>
+        </w:r>
+        <w:r>
+          <w:fldChar w:fldCharType="begin"/>
+        </w:r>
+        <w:r>
+          <w:instrText xml:space="preserve"> PAGEREF _Toc100003 \h </w:instrText>
+        </w:r>
+        <w:r>
+          <w:fldChar w:fldCharType="separate"/>
+        </w:r>
+        <w:r>
+          <w:t>3</w:t>
+        </w:r>
+        <w:r>
+          <w:fldChar w:fldCharType="end"/>
+        </w:r>
+      </w:hyperlink>
+    </w:p>
+    <w:p>
+      <w:pPr>
+        <w:pStyle w:val="TOC2"/>
+      </w:pPr>
+      <w:hyperlink w:anchor="_Toc100004" w:history="1">
+        <w:r>
+          <w:t>1.3 Assignment and Context</w:t>
+        </w:r>
+        <w:r>
+          <w:tab/>
+        </w:r>
+        <w:r>
+          <w:fldChar w:fldCharType="begin"/>
+        </w:r>
+        <w:r>
+          <w:instrText xml:space="preserve"> PAGEREF _Toc100004 \h </w:instrText>
+        </w:r>
+        <w:r>
+          <w:fldChar w:fldCharType="separate"/>
+        </w:r>
+        <w:r>
+          <w:t>3</w:t>
+        </w:r>
+        <w:r>
+          <w:fldChar w:fldCharType="end"/>
+        </w:r>
+      </w:hyperlink>
+    </w:p>
+    <w:p>
+      <w:pPr>
+        <w:pStyle w:val="TOC2"/>
+      </w:pPr>
+      <w:hyperlink w:anchor="_Toc100005" w:history="1">
+        <w:r>
+          <w:t>1.4 Project Deliverables</w:t>
+        </w:r>
+        <w:r>
+          <w:tab/>
+        </w:r>
+        <w:r>
+          <w:fldChar w:fldCharType="begin"/>
+        </w:r>
+        <w:r>
+          <w:instrText xml:space="preserve"> PAGEREF _Toc100005 \h </w:instrText>
+        </w:r>
+        <w:r>
+          <w:fldChar w:fldCharType="separate"/>
+        </w:r>
+        <w:r>
+          <w:t>3</w:t>
+        </w:r>
+        <w:r>
+          <w:fldChar w:fldCharType="end"/>
+        </w:r>
+      </w:hyperlink>
+    </w:p>
+    <w:p>
+      <w:pPr>
+        <w:pStyle w:val="TOC2"/>
+      </w:pPr>
+      <w:hyperlink w:anchor="_Toc100006" w:history="1">
+        <w:r>
+          <w:t>1.5 Schedule Overview</w:t>
+        </w:r>
+        <w:r>
+          <w:tab/>
+        </w:r>
+        <w:r>
+          <w:fldChar w:fldCharType="begin"/>
+        </w:r>
+        <w:r>
+          <w:instrText xml:space="preserve"> PAGEREF _Toc100006 \h </w:instrText>
+        </w:r>
+        <w:r>
+          <w:fldChar w:fldCharType="separate"/>
+        </w:r>
+        <w:r>
+          <w:t>4</w:t>
+        </w:r>
+        <w:r>
+          <w:fldChar w:fldCharType="end"/>
+        </w:r>
+      </w:hyperlink>
+    </w:p>
+    <w:p>
+      <w:pPr>
+        <w:pStyle w:val="TOC1"/>
+      </w:pPr>
+      <w:hyperlink w:anchor="_Toc100007" w:history="1">
+        <w:r>
+          <w:t>2. References</w:t>
+        </w:r>
+        <w:r>
+          <w:tab/>
+        </w:r>
+        <w:r>
+          <w:fldChar w:fldCharType="begin"/>
+        </w:r>
+        <w:r>
+          <w:instrText xml:space="preserve"> PAGEREF _Toc100007 \h </w:instrText>
+        </w:r>
+        <w:r>
+          <w:fldChar w:fldCharType="separate"/>
+        </w:r>
+        <w:r>
+          <w:t>4</w:t>
+        </w:r>
+        <w:r>
+          <w:fldChar w:fldCharType="end"/>
+        </w:r>
+      </w:hyperlink>
+    </w:p>
+    <w:p>
+      <w:pPr>
+        <w:pStyle w:val="TOC1"/>
+      </w:pPr>
+      <w:hyperlink w:anchor="_Toc100008" w:history="1">
+        <w:r>
+          <w:t>3. Definitions</w:t>
+        </w:r>
+        <w:r>
+          <w:tab/>
+        </w:r>
+        <w:r>
+          <w:fldChar w:fldCharType="begin"/>
+        </w:r>
+        <w:r>
+          <w:instrText xml:space="preserve"> PAGEREF _Toc100008 \h </w:instrText>
+        </w:r>
+        <w:r>
+          <w:fldChar w:fldCharType="separate"/>
+        </w:r>
+        <w:r>
+          <w:t>4</w:t>
+        </w:r>
+        <w:r>
+          <w:fldChar w:fldCharType="end"/>
+        </w:r>
+      </w:hyperlink>
+    </w:p>
+    <w:p>
+      <w:pPr>
+        <w:pStyle w:val="TOC1"/>
+      </w:pPr>
+      <w:hyperlink w:anchor="_Toc100009" w:history="1">
+        <w:r>
+          <w:t>4. Project Context</w:t>
+        </w:r>
+        <w:r>
+          <w:tab/>
+        </w:r>
+        <w:r>
+          <w:fldChar w:fldCharType="begin"/>
+        </w:r>
+        <w:r>
+          <w:instrText xml:space="preserve"> PAGEREF _Toc100009 \h </w:instrText>
+        </w:r>
+        <w:r>
+          <w:fldChar w:fldCharType="separate"/>
+        </w:r>
+        <w:r>
+          <w:t>5</w:t>
+        </w:r>
+        <w:r>
+          <w:fldChar w:fldCharType="end"/>
+        </w:r>
+      </w:hyperlink>
+    </w:p>
+    <w:p>
+      <w:pPr>
+        <w:pStyle w:val="TOC2"/>
+      </w:pPr>
+      <w:hyperlink w:anchor="_Toc100010" w:history="1">
+        <w:r>
+          <w:t>4.1 Process Model</w:t>
+        </w:r>
+        <w:r>
+          <w:tab/>
+        </w:r>
+        <w:r>
+          <w:fldChar w:fldCharType="begin"/>
+        </w:r>
+        <w:r>
+          <w:instrText xml:space="preserve"> PAGEREF _Toc100010 \h </w:instrText>
+        </w:r>
+        <w:r>
+          <w:fldChar w:fldCharType="separate"/>
+        </w:r>
+        <w:r>
+          <w:t>5</w:t>
+        </w:r>
+        <w:r>
+          <w:fldChar w:fldCharType="end"/>
+        </w:r>
+      </w:hyperlink>
+    </w:p>
+    <w:p>
+      <w:pPr>
+        <w:pStyle w:val="TOC2"/>
+      </w:pPr>
+      <w:hyperlink w:anchor="_Toc100011" w:history="1">
+        <w:r>
+          <w:t>4.2 Methods, Tools and Techniques</w:t>
+        </w:r>
+        <w:r>
+          <w:tab/>
+        </w:r>
+        <w:r>
+          <w:fldChar w:fldCharType="begin"/>
+        </w:r>
+        <w:r>
+          <w:instrText xml:space="preserve"> PAGEREF _Toc100011 \h </w:instrText>
+        </w:r>
+        <w:r>
+          <w:fldChar w:fldCharType="separate"/>
+        </w:r>
+        <w:r>
+          <w:t>5</w:t>
+        </w:r>
+        <w:r>
+          <w:fldChar w:fldCharType="end"/>
+        </w:r>
+      </w:hyperlink>
+    </w:p>
+    <w:p>
+      <w:pPr>
+        <w:pStyle w:val="TOC2"/>
+      </w:pPr>
+      <w:hyperlink w:anchor="_Toc100012" w:history="1">
+        <w:r>
+          <w:t>4.3 Product Acceptance Plan</w:t>
+        </w:r>
+        <w:r>
+          <w:tab/>
+        </w:r>
+        <w:r>
+          <w:fldChar w:fldCharType="begin"/>
+        </w:r>
+        <w:r>
+          <w:instrText xml:space="preserve"> PAGEREF _Toc100012 \h </w:instrText>
+        </w:r>
+        <w:r>
+          <w:fldChar w:fldCharType="separate"/>
+        </w:r>
+        <w:r>
+          <w:t>5</w:t>
+        </w:r>
+        <w:r>
+          <w:fldChar w:fldCharType="end"/>
+        </w:r>
+      </w:hyperlink>
+    </w:p>
+    <w:p>
+      <w:pPr>
+        <w:pStyle w:val="TOC1"/>
+      </w:pPr>
+      <w:hyperlink w:anchor="_Toc100013" w:history="1">
+        <w:r>
+          <w:t>5. Project Planning</w:t>
+        </w:r>
+        <w:r>
+          <w:tab/>
+        </w:r>
+        <w:r>
+          <w:fldChar w:fldCharType="begin"/>
+        </w:r>
+        <w:r>
+          <w:instrText xml:space="preserve"> PAGEREF _Toc100013 \h </w:instrText>
+        </w:r>
+        <w:r>
+          <w:fldChar w:fldCharType="separate"/>
+        </w:r>
+        <w:r>
+          <w:t>6</w:t>
+        </w:r>
+        <w:r>
+          <w:fldChar w:fldCharType="end"/>
+        </w:r>
+      </w:hyperlink>
+    </w:p>
+    <w:p>
+      <w:pPr>
+        <w:pStyle w:val="TOC2"/>
+      </w:pPr>
+      <w:hyperlink w:anchor="_Toc100014" w:history="1">
+        <w:r>
+          <w:t>5.1 Project Work Plan</w:t>
+        </w:r>
+        <w:r>
+          <w:tab/>
+        </w:r>
+        <w:r>
+          <w:fldChar w:fldCharType="begin"/>
+        </w:r>
+        <w:r>
+          <w:instrText xml:space="preserve"> PAGEREF _Toc100014 \h </w:instrText>
+        </w:r>
+        <w:r>
+          <w:fldChar w:fldCharType="separate"/>
+        </w:r>
+        <w:r>
+          <w:t>6</w:t>
+        </w:r>
+        <w:r>
+          <w:fldChar w:fldCharType="end"/>
+        </w:r>
+      </w:hyperlink>
+    </w:p>
+    <w:p>
+      <w:pPr>
+        <w:pStyle w:val="TOC2"/>
+      </w:pPr>
+      <w:hyperlink w:anchor="_Toc100015" w:history="1">
+        <w:r>
+          <w:t>5.2 Work Activities</w:t>
+        </w:r>
+        <w:r>
+          <w:tab/>
+        </w:r>
+        <w:r>
+          <w:fldChar w:fldCharType="begin"/>
+        </w:r>
+        <w:r>
+          <w:instrText xml:space="preserve"> PAGEREF _Toc100015 \h </w:instrText>
+        </w:r>
+        <w:r>
+          <w:fldChar w:fldCharType="separate"/>
+        </w:r>
+        <w:r>
+          <w:t>6</w:t>
+        </w:r>
+        <w:r>
+          <w:fldChar w:fldCharType="end"/>
+        </w:r>
+      </w:hyperlink>
+    </w:p>
+    <w:p>
+      <w:pPr>
+        <w:pStyle w:val="TOC2"/>
+      </w:pPr>
+      <w:hyperlink w:anchor="_Toc100016" w:history="1">
+        <w:r>
+          <w:t>5.3 Schedule Allocation</w:t>
+        </w:r>
+        <w:r>
+          <w:tab/>
+        </w:r>
+        <w:r>
+          <w:fldChar w:fldCharType="begin"/>
+        </w:r>
+        <w:r>
+          <w:instrText xml:space="preserve"> PAGEREF _Toc100016 \h </w:instrText>
+        </w:r>
+        <w:r>
+          <w:fldChar w:fldCharType="separate"/>
+        </w:r>
+        <w:r>
+          <w:t>6</w:t>
+        </w:r>
+        <w:r>
+          <w:fldChar w:fldCharType="end"/>
+        </w:r>
+      </w:hyperlink>
+    </w:p>
+    <w:p>
+      <w:pPr>
+        <w:pStyle w:val="TOC2"/>
+      </w:pPr>
+      <w:hyperlink w:anchor="_Toc100017" w:history="1">
+        <w:r>
+          <w:t>5.4 Resource Allocation</w:t>
+        </w:r>
+        <w:r>
+          <w:tab/>
+        </w:r>
+        <w:r>
+          <w:fldChar w:fldCharType="begin"/>
+        </w:r>
+        <w:r>
+          <w:instrText xml:space="preserve"> PAGEREF _Toc100017 \h </w:instrText>
+        </w:r>
+        <w:r>
+          <w:fldChar w:fldCharType="separate"/>
+        </w:r>
+        <w:r>
+          <w:t>7</w:t>
+        </w:r>
+        <w:r>
+          <w:fldChar w:fldCharType="end"/>
+        </w:r>
+      </w:hyperlink>
+    </w:p>
+    <w:p>
+      <w:pPr>
+        <w:pStyle w:val="TOC1"/>
+      </w:pPr>
+      <w:hyperlink w:anchor="_Toc100018" w:history="1">
+        <w:r>
+          <w:t>8. Supporting Process Plans</w:t>
+        </w:r>
+        <w:r>
+          <w:tab/>
+        </w:r>
+        <w:r>
+          <w:fldChar w:fldCharType="begin"/>
+        </w:r>
+        <w:r>
+          <w:instrText xml:space="preserve"> PAGEREF _Toc100018 \h </w:instrText>
+        </w:r>
+        <w:r>
+          <w:fldChar w:fldCharType="separate"/>
+        </w:r>
+        <w:r>
+          <w:t>7</w:t>
+        </w:r>
+        <w:r>
+          <w:fldChar w:fldCharType="end"/>
+        </w:r>
+      </w:hyperlink>
+    </w:p>
+    <w:p>
+      <w:pPr>
+        <w:pStyle w:val="TOC2"/>
+      </w:pPr>
+      <w:hyperlink w:anchor="_Toc100019" w:history="1">
+        <w:r>
+          <w:t>8.1 Risk Management</w:t>
+        </w:r>
+        <w:r>
+          <w:tab/>
+        </w:r>
+        <w:r>
+          <w:fldChar w:fldCharType="begin"/>
+        </w:r>
+        <w:r>
+          <w:instrText xml:space="preserve"> PAGEREF _Toc100019 \h </w:instrText>
+        </w:r>
+        <w:r>
+          <w:fldChar w:fldCharType="separate"/>
+        </w:r>
+        <w:r>
+          <w:t>7</w:t>
+        </w:r>
+        <w:r>
+          <w:fldChar w:fldCharType="end"/>
+        </w:r>
+      </w:hyperlink>
+      <w:r>
+        <w:fldChar w:fldCharType="end"/>
+      </w:r>
+    </w:p>
+    <w:p>
+      <w:r>
+        <w:br w:type="page"/>
+      </w:r>
+    </w:p>
+    <w:p>
+      <w:pPr>
+        <w:pStyle w:val="Heading1"/>
+      </w:pPr>
+      <w:bookmarkStart w:id="0" w:name="_Toc100001"/>
+      <w:r>
         <w:lastRenderedPageBreak/>
-        <w:t>Table of Contents</w:t>
-      </w:r>
-    </w:p>
-    <w:p>
-      <w:pPr>
-        <w:pStyle w:val="TOC1"/>
-      </w:pPr>
-      <w:r>
-        <w:fldChar w:fldCharType="begin"/>
-      </w:r>
-      <w:r>
-        <w:instrText xml:space="preserve"> TOC \o "1-2" \h \z \u </w:instrText>
-      </w:r>
-      <w:r>
-        <w:fldChar w:fldCharType="separate"/>
-      </w:r>
-      <w:hyperlink w:anchor="_Toc100001" w:history="1">
-        <w:r>
-          <w:t>1. Project Overview</w:t>
-        </w:r>
-        <w:r>
-          <w:tab/>
-        </w:r>
-        <w:r>
-          <w:fldChar w:fldCharType="begin"/>
-        </w:r>
-        <w:r>
-          <w:instrText xml:space="preserve"> PAGEREF _Toc100001 \h </w:instrText>
-        </w:r>
-        <w:r>
-          <w:fldChar w:fldCharType="separate"/>
-        </w:r>
-        <w:r>
-          <w:t>3</w:t>
-        </w:r>
-        <w:r>
-          <w:fldChar w:fldCharType="end"/>
-        </w:r>
-      </w:hyperlink>
-    </w:p>
-    <w:p>
-      <w:pPr>
-        <w:pStyle w:val="TOC2"/>
-      </w:pPr>
-      <w:hyperlink w:anchor="_Toc100002" w:history="1">
-        <w:r>
-          <w:t>1.1 Project Summary</w:t>
-        </w:r>
-        <w:r>
-          <w:tab/>
-        </w:r>
-        <w:r>
-          <w:fldChar w:fldCharType="begin"/>
-        </w:r>
-        <w:r>
-          <w:instrText xml:space="preserve"> PAGEREF _Toc100002 \h </w:instrText>
-        </w:r>
-        <w:r>
-          <w:fldChar w:fldCharType="separate"/>
-        </w:r>
-        <w:r>
-          <w:t>3</w:t>
-        </w:r>
-        <w:r>
-          <w:fldChar w:fldCharType="end"/>
-        </w:r>
-      </w:hyperlink>
-    </w:p>
-    <w:p>
-      <w:pPr>
-        <w:pStyle w:val="TOC2"/>
-      </w:pPr>
-      <w:hyperlink w:anchor="_Toc100003" w:history="1">
-        <w:r>
-          <w:t>1.2 Purpose, Scope and Objectives</w:t>
-        </w:r>
-        <w:r>
-          <w:tab/>
-        </w:r>
-        <w:r>
-          <w:fldChar w:fldCharType="begin"/>
-        </w:r>
-        <w:r>
-          <w:instrText xml:space="preserve"> PAGEREF _Toc100003 \h </w:instrText>
-        </w:r>
-        <w:r>
-          <w:fldChar w:fldCharType="separate"/>
-        </w:r>
-        <w:r>
-          <w:t>3</w:t>
-        </w:r>
-        <w:r>
-          <w:fldChar w:fldCharType="end"/>
-        </w:r>
-      </w:hyperlink>
-    </w:p>
-    <w:p>
-      <w:pPr>
-        <w:pStyle w:val="TOC2"/>
-      </w:pPr>
-      <w:hyperlink w:anchor="_Toc100004" w:history="1">
-        <w:r>
-          <w:t>1.3 Assignment and Context</w:t>
-        </w:r>
-        <w:r>
-          <w:tab/>
-        </w:r>
-        <w:r>
-          <w:fldChar w:fldCharType="begin"/>
-        </w:r>
-        <w:r>
-          <w:instrText xml:space="preserve"> PAGEREF _Toc100004 \h </w:instrText>
-        </w:r>
-        <w:r>
-          <w:fldChar w:fldCharType="separate"/>
-        </w:r>
-        <w:r>
-          <w:t>3</w:t>
-        </w:r>
-        <w:r>
-          <w:fldChar w:fldCharType="end"/>
-        </w:r>
-      </w:hyperlink>
-    </w:p>
-    <w:p>
-      <w:pPr>
-        <w:pStyle w:val="TOC2"/>
-      </w:pPr>
-      <w:hyperlink w:anchor="_Toc100005" w:history="1">
-        <w:r>
-          <w:t>1.4 Project Deliverables</w:t>
-        </w:r>
-        <w:r>
-          <w:tab/>
-        </w:r>
-        <w:r>
-          <w:fldChar w:fldCharType="begin"/>
-        </w:r>
-        <w:r>
-          <w:instrText xml:space="preserve"> PAGEREF _Toc100005 \h </w:instrText>
-        </w:r>
-        <w:r>
-          <w:fldChar w:fldCharType="separate"/>
-        </w:r>
-        <w:r>
-          <w:t>3</w:t>
-        </w:r>
-        <w:r>
-          <w:fldChar w:fldCharType="end"/>
-        </w:r>
-      </w:hyperlink>
-    </w:p>
-    <w:p>
-      <w:pPr>
-        <w:pStyle w:val="TOC2"/>
-      </w:pPr>
-      <w:hyperlink w:anchor="_Toc100006" w:history="1">
-        <w:r>
-          <w:t>1.5 Schedule Overview</w:t>
-        </w:r>
-        <w:r>
-          <w:tab/>
-        </w:r>
-        <w:r>
-          <w:fldChar w:fldCharType="begin"/>
-        </w:r>
-        <w:r>
-          <w:instrText xml:space="preserve"> PAGEREF _Toc100006 \h </w:instrText>
-        </w:r>
-        <w:r>
-          <w:fldChar w:fldCharType="separate"/>
-        </w:r>
-        <w:r>
-          <w:t>4</w:t>
-        </w:r>
-        <w:r>
-          <w:fldChar w:fldCharType="end"/>
-        </w:r>
-      </w:hyperlink>
-    </w:p>
-    <w:p>
-      <w:pPr>
-        <w:pStyle w:val="TOC1"/>
-      </w:pPr>
-      <w:hyperlink w:anchor="_Toc100007" w:history="1">
-        <w:r>
-          <w:t>2. References</w:t>
-        </w:r>
-        <w:r>
-          <w:tab/>
-        </w:r>
-        <w:r>
-          <w:fldChar w:fldCharType="begin"/>
-        </w:r>
-        <w:r>
-          <w:instrText xml:space="preserve"> PAGEREF _Toc100007 \h </w:instrText>
-        </w:r>
-        <w:r>
-          <w:fldChar w:fldCharType="separate"/>
-        </w:r>
-        <w:r>
-          <w:t>4</w:t>
-        </w:r>
-        <w:r>
-          <w:fldChar w:fldCharType="end"/>
-        </w:r>
-      </w:hyperlink>
-    </w:p>
-    <w:p>
-      <w:pPr>
-        <w:pStyle w:val="TOC1"/>
-      </w:pPr>
-      <w:hyperlink w:anchor="_Toc100008" w:history="1">
-        <w:r>
-          <w:t>3. Definitions</w:t>
-        </w:r>
-        <w:r>
-          <w:tab/>
-        </w:r>
-        <w:r>
-          <w:fldChar w:fldCharType="begin"/>
-        </w:r>
-        <w:r>
-          <w:instrText xml:space="preserve"> PAGEREF _Toc100008 \h </w:instrText>
-        </w:r>
-        <w:r>
-          <w:fldChar w:fldCharType="separate"/>
-        </w:r>
-        <w:r>
-          <w:t>4</w:t>
-        </w:r>
-        <w:r>
-          <w:fldChar w:fldCharType="end"/>
-        </w:r>
-      </w:hyperlink>
-    </w:p>
-    <w:p>
-      <w:pPr>
-        <w:pStyle w:val="TOC1"/>
-      </w:pPr>
-      <w:hyperlink w:anchor="_Toc100009" w:history="1">
-        <w:r>
-          <w:t>4. Project Context</w:t>
-        </w:r>
-        <w:r>
-          <w:tab/>
-        </w:r>
-        <w:r>
-          <w:fldChar w:fldCharType="begin"/>
-        </w:r>
-        <w:r>
-          <w:instrText xml:space="preserve"> PAGEREF _Toc100009 \h </w:instrText>
-        </w:r>
-        <w:r>
-          <w:fldChar w:fldCharType="separate"/>
-        </w:r>
-        <w:r>
-          <w:t>5</w:t>
-        </w:r>
-        <w:r>
-          <w:fldChar w:fldCharType="end"/>
-        </w:r>
-      </w:hyperlink>
-    </w:p>
-    <w:p>
-      <w:pPr>
-        <w:pStyle w:val="TOC2"/>
-      </w:pPr>
-      <w:hyperlink w:anchor="_Toc100010" w:history="1">
-        <w:r>
-          <w:t>4.1 Process Model</w:t>
-        </w:r>
-        <w:r>
-          <w:tab/>
-        </w:r>
-        <w:r>
-          <w:fldChar w:fldCharType="begin"/>
-        </w:r>
-        <w:r>
-          <w:instrText xml:space="preserve"> PAGEREF _Toc100010 \h </w:instrText>
-        </w:r>
-        <w:r>
-          <w:fldChar w:fldCharType="separate"/>
-        </w:r>
-        <w:r>
-          <w:t>5</w:t>
-        </w:r>
-        <w:r>
-          <w:fldChar w:fldCharType="end"/>
-        </w:r>
-      </w:hyperlink>
-    </w:p>
-    <w:p>
-      <w:pPr>
-        <w:pStyle w:val="TOC2"/>
-      </w:pPr>
-      <w:hyperlink w:anchor="_Toc100011" w:history="1">
-        <w:r>
-          <w:t>4.2 Methods, Tools and Techniques</w:t>
-        </w:r>
-        <w:r>
-          <w:tab/>
-        </w:r>
-        <w:r>
-          <w:fldChar w:fldCharType="begin"/>
-        </w:r>
-        <w:r>
-          <w:instrText xml:space="preserve"> PAGEREF _Toc100011 \h </w:instrText>
-        </w:r>
-        <w:r>
-          <w:fldChar w:fldCharType="separate"/>
-        </w:r>
-        <w:r>
-          <w:t>5</w:t>
-        </w:r>
-        <w:r>
-          <w:fldChar w:fldCharType="end"/>
-        </w:r>
-      </w:hyperlink>
-    </w:p>
-    <w:p>
-      <w:pPr>
-        <w:pStyle w:val="TOC2"/>
-      </w:pPr>
-      <w:hyperlink w:anchor="_Toc100012" w:history="1">
-        <w:r>
-          <w:t>4.3 Product Acceptance Plan</w:t>
-        </w:r>
-        <w:r>
-          <w:tab/>
-        </w:r>
-        <w:r>
-          <w:fldChar w:fldCharType="begin"/>
-        </w:r>
-        <w:r>
-          <w:instrText xml:space="preserve"> PAGEREF _Toc100012 \h </w:instrText>
-        </w:r>
-        <w:r>
-          <w:fldChar w:fldCharType="separate"/>
-        </w:r>
-        <w:r>
-          <w:t>5</w:t>
-        </w:r>
-        <w:r>
-          <w:fldChar w:fldCharType="end"/>
-        </w:r>
-      </w:hyperlink>
-    </w:p>
-    <w:p>
-      <w:pPr>
-        <w:pStyle w:val="TOC1"/>
-      </w:pPr>
-      <w:hyperlink w:anchor="_Toc100013" w:history="1">
-        <w:r>
-          <w:t>5. Project Planning</w:t>
-        </w:r>
-        <w:r>
-          <w:tab/>
-        </w:r>
-        <w:r>
-          <w:fldChar w:fldCharType="begin"/>
-        </w:r>
-        <w:r>
-          <w:instrText xml:space="preserve"> PAGEREF _Toc100013 \h </w:instrText>
-        </w:r>
-        <w:r>
-          <w:fldChar w:fldCharType="separate"/>
-        </w:r>
-        <w:r>
-          <w:t>6</w:t>
-        </w:r>
-        <w:r>
-          <w:fldChar w:fldCharType="end"/>
-        </w:r>
-      </w:hyperlink>
-    </w:p>
-    <w:p>
-      <w:pPr>
-        <w:pStyle w:val="TOC2"/>
-      </w:pPr>
-      <w:hyperlink w:anchor="_Toc100014" w:history="1">
-        <w:r>
-          <w:t>5.1 Project Work Plan</w:t>
-        </w:r>
-        <w:r>
-          <w:tab/>
-        </w:r>
-        <w:r>
-          <w:fldChar w:fldCharType="begin"/>
-        </w:r>
-        <w:r>
-          <w:instrText xml:space="preserve"> PAGEREF _Toc100014 \h </w:instrText>
-        </w:r>
-        <w:r>
-          <w:fldChar w:fldCharType="separate"/>
-        </w:r>
-        <w:r>
-          <w:t>6</w:t>
-        </w:r>
-        <w:r>
-          <w:fldChar w:fldCharType="end"/>
-        </w:r>
-      </w:hyperlink>
-    </w:p>
-    <w:p>
-      <w:pPr>
-        <w:pStyle w:val="TOC2"/>
-      </w:pPr>
-      <w:hyperlink w:anchor="_Toc100015" w:history="1">
-        <w:r>
-          <w:t>5.2 Work Activities</w:t>
-        </w:r>
-        <w:r>
-          <w:tab/>
-        </w:r>
-        <w:r>
-          <w:fldChar w:fldCharType="begin"/>
-        </w:r>
-        <w:r>
-          <w:instrText xml:space="preserve"> PAGEREF _Toc100015 \h </w:instrText>
-        </w:r>
-        <w:r>
-          <w:fldChar w:fldCharType="separate"/>
-        </w:r>
-        <w:r>
-          <w:t>6</w:t>
-        </w:r>
-        <w:r>
-          <w:fldChar w:fldCharType="end"/>
-        </w:r>
-      </w:hyperlink>
-    </w:p>
-    <w:p>
-      <w:pPr>
-        <w:pStyle w:val="TOC2"/>
-      </w:pPr>
-      <w:hyperlink w:anchor="_Toc100016" w:history="1">
-        <w:r>
-          <w:t>5.3 Schedule Allocation</w:t>
-        </w:r>
-        <w:r>
-          <w:tab/>
-        </w:r>
-        <w:r>
-          <w:fldChar w:fldCharType="begin"/>
-        </w:r>
-        <w:r>
-          <w:instrText xml:space="preserve"> PAGEREF _Toc100016 \h </w:instrText>
-        </w:r>
-        <w:r>
-          <w:fldChar w:fldCharType="separate"/>
-        </w:r>
-        <w:r>
-          <w:t>6</w:t>
-        </w:r>
-        <w:r>
-          <w:fldChar w:fldCharType="end"/>
-        </w:r>
-      </w:hyperlink>
-    </w:p>
-    <w:p>
-      <w:pPr>
-        <w:pStyle w:val="TOC2"/>
-      </w:pPr>
-      <w:hyperlink w:anchor="_Toc100017" w:history="1">
-        <w:r>
-          <w:t>5.4 Resource Allocation</w:t>
-        </w:r>
-        <w:r>
-          <w:tab/>
-        </w:r>
-        <w:r>
-          <w:fldChar w:fldCharType="begin"/>
-        </w:r>
-        <w:r>
-          <w:instrText xml:space="preserve"> PAGEREF _Toc100017 \h </w:instrText>
-        </w:r>
-        <w:r>
-          <w:fldChar w:fldCharType="separate"/>
-        </w:r>
-        <w:r>
-          <w:t>7</w:t>
-        </w:r>
-        <w:r>
-          <w:fldChar w:fldCharType="end"/>
-        </w:r>
-      </w:hyperlink>
-    </w:p>
-    <w:p>
-      <w:pPr>
-        <w:pStyle w:val="TOC1"/>
-      </w:pPr>
-      <w:hyperlink w:anchor="_Toc100018" w:history="1">
-        <w:r>
-          <w:t>8. Supporting Process Plans</w:t>
-        </w:r>
-        <w:r>
-          <w:tab/>
-        </w:r>
-        <w:r>
-          <w:fldChar w:fldCharType="begin"/>
-        </w:r>
-        <w:r>
-          <w:instrText xml:space="preserve"> PAGEREF _Toc100018 \h </w:instrText>
-        </w:r>
-        <w:r>
-          <w:fldChar w:fldCharType="separate"/>
-        </w:r>
-        <w:r>
-          <w:t>7</w:t>
-        </w:r>
-        <w:r>
-          <w:fldChar w:fldCharType="end"/>
-        </w:r>
-      </w:hyperlink>
-    </w:p>
-    <w:p>
-      <w:pPr>
-        <w:pStyle w:val="TOC2"/>
-      </w:pPr>
-      <w:hyperlink w:anchor="_Toc100019" w:history="1">
-        <w:r>
-          <w:t>8.1 Risk Management</w:t>
-        </w:r>
-        <w:r>
-          <w:tab/>
-        </w:r>
-        <w:r>
-          <w:fldChar w:fldCharType="begin"/>
-        </w:r>
-        <w:r>
-          <w:instrText xml:space="preserve"> PAGEREF _Toc100019 \h </w:instrText>
-        </w:r>
-        <w:r>
-          <w:fldChar w:fldCharType="separate"/>
-        </w:r>
-        <w:r>
-          <w:t>7</w:t>
-        </w:r>
-        <w:r>
-          <w:fldChar w:fldCharType="end"/>
-        </w:r>
-      </w:hyperlink>
-      <w:r>
-        <w:fldChar w:fldCharType="end"/>
-      </w:r>
-    </w:p>
-    <w:p>
-      <w:r>
-        <w:br w:type="page"/>
-      </w:r>
-    </w:p>
+        <w:t>1. Project Overview</w:t>
+      </w:r>
+      <w:bookmarkEnd w:id="0"/>
+    </w:p>
+    <w:p>
+      <w:pPr>
+        <w:pStyle w:val="Heading2"/>
+      </w:pPr>
+      <w:bookmarkStart w:id="1" w:name="_Toc100002"/>
+      <w:r>
+        <w:t>1.1 Project Summary</w:t>
+      </w:r>
+      <w:bookmarkEnd w:id="1"/>
+    </w:p>
+    <w:p>
+      <w:r>
+        <w:t>The Course Registration and Timetable Scheduler is a standalone two-tier desktop application designed to support student course registration and timetable management. The system allows students to register for available courses, drop registered courses, and view their timetable. Administrators can manage the course catalog, student records, timetables, and registration reports. The system uses Java Swing for the graphical user interface, MySQL for data storage, and JDBC for database connectivity.</w:t>
+      </w:r>
+    </w:p>
+    <w:p/>
+    <w:p/>
+    <w:p>
+      <w:pPr>
+        <w:pStyle w:val="Heading2"/>
+      </w:pPr>
+      <w:bookmarkStart w:id="2" w:name="_Toc100003"/>
+      <w:r>
+        <w:t>1.2 Purpose, Scope and Objectives</w:t>
+      </w:r>
+      <w:bookmarkEnd w:id="2"/>
+    </w:p>
+    <w:p>
+      <w:r>
+        <w:rPr>
+          <w:b/>
+        </w:rPr>
+        <w:t>Purpose</w:t>
+      </w:r>
+    </w:p>
+    <w:p>
+      <w:r>
+        <w:t>The purpose of the project is to provide a centralized and efficient way to manage course registration and timetable scheduling while reducing manual work and scheduling errors.</w:t>
+      </w:r>
+    </w:p>
+    <w:p>
+      <w:r>
+        <w:rPr>
+          <w:b/>
+        </w:rPr>
+        <w:t>Scope</w:t>
+      </w:r>
+    </w:p>
+    <w:p>
+      <w:pPr>
+        <w:pStyle w:val="ListBullet"/>
+        <w:tabs>
+          <w:tab w:val="num" w:pos="360"/>
+        </w:tabs>
+        <w:ind w:left="360" w:hanging="360"/>
+      </w:pPr>
+      <w:r>
+        <w:t>Student and administrator login.</w:t>
+      </w:r>
+    </w:p>
+    <w:p>
+      <w:pPr>
+        <w:pStyle w:val="ListBullet"/>
+        <w:tabs>
+          <w:tab w:val="num" w:pos="360"/>
+        </w:tabs>
+        <w:ind w:left="360" w:hanging="360"/>
+      </w:pPr>
+      <w:r>
+        <w:t>Course addition, editing and deletion by the administrator.</w:t>
+      </w:r>
+    </w:p>
+    <w:p>
+      <w:pPr>
+        <w:pStyle w:val="ListBullet"/>
+        <w:tabs>
+          <w:tab w:val="num" w:pos="360"/>
+        </w:tabs>
+        <w:ind w:left="360" w:hanging="360"/>
+      </w:pPr>
+      <w:r>
+        <w:t>Student course registration and course dropping.</w:t>
+      </w:r>
+    </w:p>
+    <w:p>
+      <w:pPr>
+        <w:pStyle w:val="ListBullet"/>
+        <w:tabs>
+          <w:tab w:val="num" w:pos="360"/>
+        </w:tabs>
+        <w:ind w:left="360" w:hanging="360"/>
+      </w:pPr>
+      <w:r>
+        <w:t>Timetable clash detection and timetable generation.</w:t>
+      </w:r>
+    </w:p>
+    <w:p>
+      <w:pPr>
+        <w:pStyle w:val="ListBullet"/>
+        <w:tabs>
+          <w:tab w:val="num" w:pos="360"/>
+        </w:tabs>
+        <w:ind w:left="360" w:hanging="360"/>
+      </w:pPr>
+      <w:r>
+        <w:t>Student timetable viewing.</w:t>
+      </w:r>
+    </w:p>
+    <w:p>
+      <w:pPr>
+        <w:pStyle w:val="ListBullet"/>
+        <w:tabs>
+          <w:tab w:val="num" w:pos="360"/>
+        </w:tabs>
+        <w:ind w:left="360" w:hanging="360"/>
+      </w:pPr>
+      <w:r>
+        <w:t>Registration and timetable-related reports.</w:t>
+      </w:r>
+    </w:p>
+    <w:p>
+      <w:r>
+        <w:rPr>
+          <w:b/>
+        </w:rPr>
+        <w:t>Objectives</w:t>
+      </w:r>
+    </w:p>
+    <w:p>
+      <w:pPr>
+        <w:pStyle w:val="ListBullet"/>
+        <w:tabs>
+          <w:tab w:val="num" w:pos="360"/>
+        </w:tabs>
+        <w:ind w:left="360" w:hanging="360"/>
+      </w:pPr>
+      <w:r>
+        <w:t>Provide secure role-based access for students and administrators.</w:t>
+      </w:r>
+    </w:p>
+    <w:p>
+      <w:pPr>
+        <w:pStyle w:val="ListBullet"/>
+        <w:tabs>
+          <w:tab w:val="num" w:pos="360"/>
+        </w:tabs>
+        <w:ind w:left="360" w:hanging="360"/>
+      </w:pPr>
+      <w:r>
+        <w:t>Maintain accurate and centralized course information.</w:t>
+      </w:r>
+    </w:p>
+    <w:p>
+      <w:pPr>
+        <w:pStyle w:val="ListBullet"/>
+        <w:tabs>
+          <w:tab w:val="num" w:pos="360"/>
+        </w:tabs>
+        <w:ind w:left="360" w:hanging="360"/>
+      </w:pPr>
+      <w:r>
+        <w:t>Prevent timetable conflicts during course registration.</w:t>
+      </w:r>
+    </w:p>
+    <w:p>
+      <w:pPr>
+        <w:pStyle w:val="ListBullet"/>
+        <w:tabs>
+          <w:tab w:val="num" w:pos="360"/>
+        </w:tabs>
+        <w:ind w:left="360" w:hanging="360"/>
+      </w:pPr>
+      <w:r>
+        <w:t>Generate a clear timetable for registered courses.</w:t>
+      </w:r>
+    </w:p>
+    <w:p>
+      <w:pPr>
+        <w:pStyle w:val="ListBullet"/>
+        <w:tabs>
+          <w:tab w:val="num" w:pos="360"/>
+        </w:tabs>
+        <w:ind w:left="360" w:hanging="360"/>
+      </w:pPr>
+      <w:r>
+        <w:t>Provide useful registration summaries and administrative reports.</w:t>
+      </w:r>
+    </w:p>
+    <w:p>
+      <w:pPr>
+        <w:pStyle w:val="ListBullet"/>
+        <w:numPr>
+          <w:ilvl w:val="0"/>
+          <w:numId w:val="0"/>
+        </w:numPr>
+      </w:pPr>
+    </w:p>
+    <w:p>
+      <w:pPr>
+        <w:pStyle w:val="ListBullet"/>
+        <w:numPr>
+          <w:ilvl w:val="0"/>
+          <w:numId w:val="0"/>
+        </w:numPr>
+      </w:pPr>
+    </w:p>
+    <w:p>
+      <w:pPr>
+        <w:pStyle w:val="Heading2"/>
+      </w:pPr>
+      <w:bookmarkStart w:id="3" w:name="_Toc100004"/>
+      <w:r>
+        <w:t>1.3 Assignment and Context</w:t>
+      </w:r>
+      <w:bookmarkEnd w:id="3"/>
+    </w:p>
+    <w:p>
+      <w:r>
+        <w:t>The project is developed as a Software Engineering / Software Construction course project. It applies software engineering concepts including requirements specification, system modeling, use cases, sequence diagrams, domain modeling, class design, database connectivity, and project planning. The current system documentation identifies students and administrators as the main user classes.</w:t>
+      </w:r>
+    </w:p>
+    <w:p>
+      <w:pPr>
+        <w:pStyle w:val="Heading2"/>
+      </w:pPr>
+      <w:bookmarkStart w:id="4" w:name="_Toc100005"/>
+    </w:p>
+    <w:p>
+      <w:pPr>
+        <w:pStyle w:val="Heading2"/>
+      </w:pPr>
+      <w:r>
+        <w:t>1.4 Project Deliverables</w:t>
+      </w:r>
+      <w:bookmarkEnd w:id="4"/>
+    </w:p>
+    <w:p>
+      <w:pPr>
+        <w:pStyle w:val="ListBullet"/>
+        <w:tabs>
+          <w:tab w:val="num" w:pos="360"/>
+        </w:tabs>
+        <w:ind w:left="360" w:hanging="360"/>
+      </w:pPr>
+      <w:r>
+        <w:t>Project requirements and project documentation.</w:t>
+      </w:r>
+    </w:p>
+    <w:p>
+      <w:pPr>
+        <w:pStyle w:val="ListBullet"/>
+        <w:tabs>
+          <w:tab w:val="num" w:pos="360"/>
+        </w:tabs>
+        <w:ind w:left="360" w:hanging="360"/>
+      </w:pPr>
+      <w:r>
+        <w:t>Use Case Diagram and Use Case Descriptions.</w:t>
+      </w:r>
+    </w:p>
+    <w:p>
+      <w:pPr>
+        <w:pStyle w:val="ListBullet"/>
+        <w:tabs>
+          <w:tab w:val="num" w:pos="360"/>
+        </w:tabs>
+        <w:ind w:left="360" w:hanging="360"/>
+      </w:pPr>
+      <w:r>
+        <w:t>System Sequence Diagrams for major use cases.</w:t>
+      </w:r>
+    </w:p>
+    <w:p>
+      <w:pPr>
+        <w:pStyle w:val="ListBullet"/>
+        <w:tabs>
+          <w:tab w:val="num" w:pos="360"/>
+        </w:tabs>
+        <w:ind w:left="360" w:hanging="360"/>
+      </w:pPr>
+      <w:r>
+        <w:t>Domain Model.</w:t>
+      </w:r>
+    </w:p>
+    <w:p>
+      <w:pPr>
+        <w:pStyle w:val="ListBullet"/>
+        <w:tabs>
+          <w:tab w:val="num" w:pos="360"/>
+        </w:tabs>
+        <w:ind w:left="360" w:hanging="360"/>
+      </w:pPr>
+      <w:r>
+        <w:t>Sequence Diagram.</w:t>
+      </w:r>
+    </w:p>
+    <w:p>
+      <w:pPr>
+        <w:pStyle w:val="ListBullet"/>
+        <w:tabs>
+          <w:tab w:val="num" w:pos="360"/>
+        </w:tabs>
+        <w:ind w:left="360" w:hanging="360"/>
+      </w:pPr>
+      <w:r>
+        <w:t>Design Class Diagram.</w:t>
+      </w:r>
+    </w:p>
+    <w:p>
+      <w:pPr>
+        <w:pStyle w:val="ListBullet"/>
+        <w:tabs>
+          <w:tab w:val="num" w:pos="360"/>
+        </w:tabs>
+        <w:ind w:left="360" w:hanging="360"/>
+      </w:pPr>
+      <w:r>
+        <w:t>Java Swing based application interface.</w:t>
+      </w:r>
+    </w:p>
+    <w:p>
+      <w:pPr>
+        <w:pStyle w:val="ListBullet"/>
+        <w:tabs>
+          <w:tab w:val="num" w:pos="360"/>
+        </w:tabs>
+        <w:ind w:left="360" w:hanging="360"/>
+      </w:pPr>
+      <w:r>
+        <w:t>MySQL database and JDBC connectivity.</w:t>
+      </w:r>
+    </w:p>
+    <w:p>
+      <w:pPr>
+        <w:pStyle w:val="ListBullet"/>
+        <w:tabs>
+          <w:tab w:val="num" w:pos="360"/>
+        </w:tabs>
+        <w:ind w:left="360" w:hanging="360"/>
+      </w:pPr>
+      <w:r>
+        <w:t>Course registration, timetable and reporting functionality.</w:t>
+      </w:r>
+    </w:p>
+    <w:p>
+      <w:pPr>
+        <w:pStyle w:val="Heading2"/>
+      </w:pPr>
+      <w:bookmarkStart w:id="5" w:name="_Toc100006"/>
+      <w:r>
+        <w:t>1.5 Schedule Overview</w:t>
+      </w:r>
+      <w:bookmarkEnd w:id="5"/>
+    </w:p>
+    <w:p>
+      <w:r>
+        <w:t>The following is a proposed project schedule for organizing the work. Exact dates can be adjusted according to the course/instructor schedule.</w:t>
+      </w:r>
+    </w:p>
+    <w:tbl>
+      <w:tblPr>
+        <w:tblStyle w:val="TableGrid"/>
+        <w:tblW w:w="0" w:type="auto"/>
+        <w:jc w:val="center"/>
+        <w:tblLook w:val="04A0" w:firstRow="1" w:lastRow="0" w:firstColumn="1" w:lastColumn="0" w:noHBand="0" w:noVBand="1"/>
+      </w:tblPr>
+      <w:tblGrid>
+        <w:gridCol w:w="3309"/>
+        <w:gridCol w:w="3309"/>
+        <w:gridCol w:w="3308"/>
+      </w:tblGrid>
+      <w:tr>
+        <w:trPr>
+          <w:jc w:val="center"/>
+        </w:trPr>
+        <w:tc>
+          <w:tcPr>
+            <w:tcW w:w="3312" w:type="dxa"/>
+            <w:vAlign w:val="center"/>
+          </w:tcPr>
+          <w:p>
+            <w:r>
+              <w:rPr>
+                <w:sz w:val="20"/>
+              </w:rPr>
+              <w:t>Phase</w:t>
+            </w:r>
+          </w:p>
+        </w:tc>
+        <w:tc>
+          <w:tcPr>
+            <w:tcW w:w="3312" w:type="dxa"/>
+            <w:vAlign w:val="center"/>
+          </w:tcPr>
+          <w:p>
+            <w:r>
+              <w:rPr>
+                <w:sz w:val="20"/>
+              </w:rPr>
+              <w:t>Main Activities</w:t>
+            </w:r>
+          </w:p>
+        </w:tc>
+        <w:tc>
+          <w:tcPr>
+            <w:tcW w:w="3312" w:type="dxa"/>
+            <w:vAlign w:val="center"/>
+          </w:tcPr>
+          <w:p>
+            <w:r>
+              <w:rPr>
+                <w:sz w:val="20"/>
+              </w:rPr>
+              <w:t>Planned Duration</w:t>
+            </w:r>
+          </w:p>
+        </w:tc>
+      </w:tr>
+      <w:tr>
+        <w:trPr>
+          <w:jc w:val="center"/>
+        </w:trPr>
+        <w:tc>
+          <w:tcPr>
+            <w:tcW w:w="3312" w:type="dxa"/>
+            <w:vAlign w:val="center"/>
+          </w:tcPr>
+          <w:p>
+            <w:r>
+              <w:rPr>
+                <w:sz w:val="20"/>
+              </w:rPr>
+              <w:t>1. Requirements &amp; Planning</w:t>
+            </w:r>
+          </w:p>
+        </w:tc>
+        <w:tc>
+          <w:tcPr>
+            <w:tcW w:w="3312" w:type="dxa"/>
+            <w:vAlign w:val="center"/>
+          </w:tcPr>
+          <w:p>
+            <w:r>
+              <w:rPr>
+                <w:sz w:val="20"/>
+              </w:rPr>
+              <w:t>Requirements, scope, objectives and project plan</w:t>
+            </w:r>
+          </w:p>
+        </w:tc>
+        <w:tc>
+          <w:tcPr>
+            <w:tcW w:w="3312" w:type="dxa"/>
+            <w:vAlign w:val="center"/>
+          </w:tcPr>
+          <w:p>
+            <w:r>
+              <w:rPr>
+                <w:sz w:val="20"/>
+              </w:rPr>
+              <w:t>Week 1</w:t>
+            </w:r>
+          </w:p>
+        </w:tc>
+      </w:tr>
+      <w:tr>
+        <w:trPr>
+          <w:jc w:val="center"/>
+        </w:trPr>
+        <w:tc>
+          <w:tcPr>
+            <w:tcW w:w="3312" w:type="dxa"/>
+            <w:vAlign w:val="center"/>
+          </w:tcPr>
+          <w:p>
+            <w:r>
+              <w:rPr>
+                <w:sz w:val="20"/>
+              </w:rPr>
+              <w:t>2. Analysis &amp; Modeling</w:t>
+            </w:r>
+          </w:p>
+        </w:tc>
+        <w:tc>
+          <w:tcPr>
+            <w:tcW w:w="3312" w:type="dxa"/>
+            <w:vAlign w:val="center"/>
+          </w:tcPr>
+          <w:p>
+            <w:r>
+              <w:rPr>
+                <w:sz w:val="20"/>
+              </w:rPr>
+              <w:t>Use cases, SSDs, domain model and sequence diagram</w:t>
+            </w:r>
+          </w:p>
+        </w:tc>
+        <w:tc>
+          <w:tcPr>
+            <w:tcW w:w="3312" w:type="dxa"/>
+            <w:vAlign w:val="center"/>
+          </w:tcPr>
+          <w:p>
+            <w:r>
+              <w:rPr>
+                <w:sz w:val="20"/>
+              </w:rPr>
+              <w:t>Weeks 2–3</w:t>
+            </w:r>
+          </w:p>
+        </w:tc>
+      </w:tr>
+      <w:tr>
+        <w:trPr>
+          <w:jc w:val="center"/>
+        </w:trPr>
+        <w:tc>
+          <w:tcPr>
+            <w:tcW w:w="3312" w:type="dxa"/>
+            <w:vAlign w:val="center"/>
+          </w:tcPr>
+          <w:p>
+            <w:r>
+              <w:rPr>
+                <w:sz w:val="20"/>
+              </w:rPr>
+              <w:t>3. Design</w:t>
+            </w:r>
+          </w:p>
+        </w:tc>
+        <w:tc>
+          <w:tcPr>
+            <w:tcW w:w="3312" w:type="dxa"/>
+            <w:vAlign w:val="center"/>
+          </w:tcPr>
+          <w:p>
+            <w:r>
+              <w:rPr>
+                <w:sz w:val="20"/>
+              </w:rPr>
+              <w:t>Class design, database structure and interface design</w:t>
+            </w:r>
+          </w:p>
+        </w:tc>
+        <w:tc>
+          <w:tcPr>
+            <w:tcW w:w="3312" w:type="dxa"/>
+            <w:vAlign w:val="center"/>
+          </w:tcPr>
+          <w:p>
+            <w:r>
+              <w:rPr>
+                <w:sz w:val="20"/>
+              </w:rPr>
+              <w:t>Week 4</w:t>
+            </w:r>
+          </w:p>
+        </w:tc>
+      </w:tr>
+      <w:tr>
+        <w:trPr>
+          <w:jc w:val="center"/>
+        </w:trPr>
+        <w:tc>
+          <w:tcPr>
+            <w:tcW w:w="3312" w:type="dxa"/>
+            <w:vAlign w:val="center"/>
+          </w:tcPr>
+          <w:p>
+            <w:r>
+              <w:rPr>
+                <w:sz w:val="20"/>
+              </w:rPr>
+              <w:t>4. Implementation</w:t>
+            </w:r>
+          </w:p>
+        </w:tc>
+        <w:tc>
+          <w:tcPr>
+            <w:tcW w:w="3312" w:type="dxa"/>
+            <w:vAlign w:val="center"/>
+          </w:tcPr>
+          <w:p>
+            <w:r>
+              <w:rPr>
+                <w:sz w:val="20"/>
+              </w:rPr>
+              <w:t>Java Swing, MySQL and JDBC implementation</w:t>
+            </w:r>
+          </w:p>
+        </w:tc>
+        <w:tc>
+          <w:tcPr>
+            <w:tcW w:w="3312" w:type="dxa"/>
+            <w:vAlign w:val="center"/>
+          </w:tcPr>
+          <w:p>
+            <w:r>
+              <w:rPr>
+                <w:sz w:val="20"/>
+              </w:rPr>
+              <w:t>Weeks 5–7</w:t>
+            </w:r>
+          </w:p>
+        </w:tc>
+      </w:tr>
+      <w:tr>
+        <w:trPr>
+          <w:jc w:val="center"/>
+        </w:trPr>
+        <w:tc>
+          <w:tcPr>
+            <w:tcW w:w="3312" w:type="dxa"/>
+            <w:vAlign w:val="center"/>
+          </w:tcPr>
+          <w:p>
+            <w:r>
+              <w:rPr>
+                <w:sz w:val="20"/>
+              </w:rPr>
+              <w:t>5. Testing &amp; Refinement</w:t>
+            </w:r>
+          </w:p>
+        </w:tc>
+        <w:tc>
+          <w:tcPr>
+            <w:tcW w:w="3312" w:type="dxa"/>
+            <w:vAlign w:val="center"/>
+          </w:tcPr>
+          <w:p>
+            <w:r>
+              <w:rPr>
+                <w:sz w:val="20"/>
+              </w:rPr>
+              <w:t>Functional testing, clash checking and corrections</w:t>
+            </w:r>
+          </w:p>
+        </w:tc>
+        <w:tc>
+          <w:tcPr>
+            <w:tcW w:w="3312" w:type="dxa"/>
+            <w:vAlign w:val="center"/>
+          </w:tcPr>
+          <w:p>
+            <w:r>
+              <w:rPr>
+                <w:sz w:val="20"/>
+              </w:rPr>
+              <w:t>Week 8</w:t>
+            </w:r>
+          </w:p>
+        </w:tc>
+      </w:tr>
+      <w:tr>
+        <w:trPr>
+          <w:jc w:val="center"/>
+        </w:trPr>
+        <w:tc>
+          <w:tcPr>
+            <w:tcW w:w="3312" w:type="dxa"/>
+            <w:vAlign w:val="center"/>
+          </w:tcPr>
+          <w:p>
+            <w:r>
+              <w:rPr>
+                <w:sz w:val="20"/>
+              </w:rPr>
+              <w:t>6. Documentation &amp; Review</w:t>
+            </w:r>
+          </w:p>
+        </w:tc>
+        <w:tc>
+          <w:tcPr>
+            <w:tcW w:w="3312" w:type="dxa"/>
+            <w:vAlign w:val="center"/>
+          </w:tcPr>
+          <w:p>
+            <w:r>
+              <w:rPr>
+                <w:sz w:val="20"/>
+              </w:rPr>
+              <w:t>Final documentation, review and presentation preparation</w:t>
+            </w:r>
+          </w:p>
+        </w:tc>
+        <w:tc>
+          <w:tcPr>
+            <w:tcW w:w="3312" w:type="dxa"/>
+            <w:vAlign w:val="center"/>
+          </w:tcPr>
+          <w:p>
+            <w:r>
+              <w:rPr>
+                <w:sz w:val="20"/>
+              </w:rPr>
+              <w:t>Week 9</w:t>
+            </w:r>
+          </w:p>
+        </w:tc>
+      </w:tr>
+    </w:tbl>
     <w:p>
       <w:pPr>
         <w:pStyle w:val="Heading1"/>
       </w:pPr>
-      <w:bookmarkStart w:id="0" w:name="_Toc100013"/>
-      <w:r>
-        <w:lastRenderedPageBreak/>
-        <w:t>5. Project Planning</w:t>
-      </w:r>
-      <w:bookmarkEnd w:id="0"/>
+      <w:bookmarkStart w:id="6" w:name="_Toc100007"/>
+      <w:r>
+        <w:t>2. References</w:t>
+      </w:r>
+      <w:bookmarkEnd w:id="6"/>
+    </w:p>
+    <w:p>
+      <w:pPr>
+        <w:pStyle w:val="ListBullet"/>
+        <w:tabs>
+          <w:tab w:val="num" w:pos="360"/>
+        </w:tabs>
+        <w:ind w:left="360" w:hanging="360"/>
+      </w:pPr>
+      <w:r>
+        <w:t>IEEE Std 830-1998, IEEE Recommended Practice for Software Requirements Specifications.</w:t>
+      </w:r>
+    </w:p>
+    <w:p>
+      <w:pPr>
+        <w:pStyle w:val="ListBullet"/>
+        <w:tabs>
+          <w:tab w:val="num" w:pos="360"/>
+        </w:tabs>
+        <w:ind w:left="360" w:hanging="360"/>
+      </w:pPr>
+      <w:r>
+        <w:t>Oracle Java Swing API Documentation.</w:t>
+      </w:r>
+    </w:p>
+    <w:p>
+      <w:pPr>
+        <w:pStyle w:val="ListBullet"/>
+        <w:tabs>
+          <w:tab w:val="num" w:pos="360"/>
+        </w:tabs>
+        <w:ind w:left="360" w:hanging="360"/>
+      </w:pPr>
+      <w:r>
+        <w:t>MySQL 8.0 Developer Reference Manual.</w:t>
+      </w:r>
+    </w:p>
+    <w:p>
+      <w:pPr>
+        <w:pStyle w:val="Heading1"/>
+      </w:pPr>
+      <w:bookmarkStart w:id="7" w:name="_Toc100008"/>
+    </w:p>
+    <w:p>
+      <w:pPr>
+        <w:pStyle w:val="Heading1"/>
+      </w:pPr>
+      <w:r>
+        <w:t>3. Definitions</w:t>
+      </w:r>
+      <w:bookmarkEnd w:id="7"/>
+    </w:p>
+    <w:tbl>
+      <w:tblPr>
+        <w:tblStyle w:val="TableGrid"/>
+        <w:tblW w:w="0" w:type="auto"/>
+        <w:jc w:val="center"/>
+        <w:tblLook w:val="04A0" w:firstRow="1" w:lastRow="0" w:firstColumn="1" w:lastColumn="0" w:noHBand="0" w:noVBand="1"/>
+      </w:tblPr>
+      <w:tblGrid>
+        <w:gridCol w:w="4963"/>
+        <w:gridCol w:w="4963"/>
+      </w:tblGrid>
+      <w:tr>
+        <w:trPr>
+          <w:jc w:val="center"/>
+        </w:trPr>
+        <w:tc>
+          <w:tcPr>
+            <w:tcW w:w="4968" w:type="dxa"/>
+            <w:vAlign w:val="center"/>
+          </w:tcPr>
+          <w:p>
+            <w:r>
+              <w:rPr>
+                <w:sz w:val="20"/>
+              </w:rPr>
+              <w:t>Term</w:t>
+            </w:r>
+          </w:p>
+        </w:tc>
+        <w:tc>
+          <w:tcPr>
+            <w:tcW w:w="4968" w:type="dxa"/>
+            <w:vAlign w:val="center"/>
+          </w:tcPr>
+          <w:p>
+            <w:r>
+              <w:rPr>
+                <w:sz w:val="20"/>
+              </w:rPr>
+              <w:t>Definition</w:t>
+            </w:r>
+          </w:p>
+        </w:tc>
+      </w:tr>
+      <w:tr>
+        <w:trPr>
+          <w:jc w:val="center"/>
+        </w:trPr>
+        <w:tc>
+          <w:tcPr>
+            <w:tcW w:w="4968" w:type="dxa"/>
+            <w:vAlign w:val="center"/>
+          </w:tcPr>
+          <w:p>
+            <w:r>
+              <w:rPr>
+                <w:sz w:val="20"/>
+              </w:rPr>
+              <w:t>GUI</w:t>
+            </w:r>
+          </w:p>
+        </w:tc>
+        <w:tc>
+          <w:tcPr>
+            <w:tcW w:w="4968" w:type="dxa"/>
+            <w:vAlign w:val="center"/>
+          </w:tcPr>
+          <w:p>
+            <w:r>
+              <w:rPr>
+                <w:sz w:val="20"/>
+              </w:rPr>
+              <w:t>Graphical User Interface</w:t>
+            </w:r>
+          </w:p>
+        </w:tc>
+      </w:tr>
+      <w:tr>
+        <w:trPr>
+          <w:jc w:val="center"/>
+        </w:trPr>
+        <w:tc>
+          <w:tcPr>
+            <w:tcW w:w="4968" w:type="dxa"/>
+            <w:vAlign w:val="center"/>
+          </w:tcPr>
+          <w:p>
+            <w:r>
+              <w:rPr>
+                <w:sz w:val="20"/>
+              </w:rPr>
+              <w:t>DBMS</w:t>
+            </w:r>
+          </w:p>
+        </w:tc>
+        <w:tc>
+          <w:tcPr>
+            <w:tcW w:w="4968" w:type="dxa"/>
+            <w:vAlign w:val="center"/>
+          </w:tcPr>
+          <w:p>
+            <w:r>
+              <w:rPr>
+                <w:sz w:val="20"/>
+              </w:rPr>
+              <w:t>Database Management System</w:t>
+            </w:r>
+          </w:p>
+        </w:tc>
+      </w:tr>
+      <w:tr>
+        <w:trPr>
+          <w:jc w:val="center"/>
+        </w:trPr>
+        <w:tc>
+          <w:tcPr>
+            <w:tcW w:w="4968" w:type="dxa"/>
+            <w:vAlign w:val="center"/>
+          </w:tcPr>
+          <w:p>
+            <w:r>
+              <w:rPr>
+                <w:sz w:val="20"/>
+              </w:rPr>
+              <w:t>JDBC</w:t>
+            </w:r>
+          </w:p>
+        </w:tc>
+        <w:tc>
+          <w:tcPr>
+            <w:tcW w:w="4968" w:type="dxa"/>
+            <w:vAlign w:val="center"/>
+          </w:tcPr>
+          <w:p>
+            <w:r>
+              <w:rPr>
+                <w:sz w:val="20"/>
+              </w:rPr>
+              <w:t>Java Database Connectivity</w:t>
+            </w:r>
+          </w:p>
+        </w:tc>
+      </w:tr>
+      <w:tr>
+        <w:trPr>
+          <w:jc w:val="center"/>
+        </w:trPr>
+        <w:tc>
+          <w:tcPr>
+            <w:tcW w:w="4968" w:type="dxa"/>
+            <w:vAlign w:val="center"/>
+          </w:tcPr>
+          <w:p>
+            <w:r>
+              <w:rPr>
+                <w:sz w:val="20"/>
+              </w:rPr>
+              <w:t>FR</w:t>
+            </w:r>
+          </w:p>
+        </w:tc>
+        <w:tc>
+          <w:tcPr>
+            <w:tcW w:w="4968" w:type="dxa"/>
+            <w:vAlign w:val="center"/>
+          </w:tcPr>
+          <w:p>
+            <w:r>
+              <w:rPr>
+                <w:sz w:val="20"/>
+              </w:rPr>
+              <w:t>Functional Requirement</w:t>
+            </w:r>
+          </w:p>
+        </w:tc>
+      </w:tr>
+      <w:tr>
+        <w:trPr>
+          <w:jc w:val="center"/>
+        </w:trPr>
+        <w:tc>
+          <w:tcPr>
+            <w:tcW w:w="4968" w:type="dxa"/>
+            <w:vAlign w:val="center"/>
+          </w:tcPr>
+          <w:p>
+            <w:r>
+              <w:rPr>
+                <w:sz w:val="20"/>
+              </w:rPr>
+              <w:t>NFR</w:t>
+            </w:r>
+          </w:p>
+        </w:tc>
+        <w:tc>
+          <w:tcPr>
+            <w:tcW w:w="4968" w:type="dxa"/>
+            <w:vAlign w:val="center"/>
+          </w:tcPr>
+          <w:p>
+            <w:r>
+              <w:rPr>
+                <w:sz w:val="20"/>
+              </w:rPr>
+              <w:t>Non-Functional Requirement</w:t>
+            </w:r>
+          </w:p>
+        </w:tc>
+      </w:tr>
+      <w:tr>
+        <w:trPr>
+          <w:jc w:val="center"/>
+        </w:trPr>
+        <w:tc>
+          <w:tcPr>
+            <w:tcW w:w="4968" w:type="dxa"/>
+            <w:vAlign w:val="center"/>
+          </w:tcPr>
+          <w:p>
+            <w:r>
+              <w:rPr>
+                <w:sz w:val="20"/>
+              </w:rPr>
+              <w:t>MVC</w:t>
+            </w:r>
+          </w:p>
+        </w:tc>
+        <w:tc>
+          <w:tcPr>
+            <w:tcW w:w="4968" w:type="dxa"/>
+            <w:vAlign w:val="center"/>
+          </w:tcPr>
+          <w:p>
+            <w:r>
+              <w:rPr>
+                <w:sz w:val="20"/>
+              </w:rPr>
+              <w:t>Model-View-Controller Design Pattern</w:t>
+            </w:r>
+          </w:p>
+        </w:tc>
+      </w:tr>
+      <w:tr>
+        <w:trPr>
+          <w:jc w:val="center"/>
+        </w:trPr>
+        <w:tc>
+          <w:tcPr>
+            <w:tcW w:w="4968" w:type="dxa"/>
+            <w:vAlign w:val="center"/>
+          </w:tcPr>
+          <w:p>
+            <w:r>
+              <w:rPr>
+                <w:sz w:val="20"/>
+              </w:rPr>
+              <w:t>SSD</w:t>
+            </w:r>
+          </w:p>
+        </w:tc>
+        <w:tc>
+          <w:tcPr>
+            <w:tcW w:w="4968" w:type="dxa"/>
+            <w:vAlign w:val="center"/>
+          </w:tcPr>
+          <w:p>
+            <w:r>
+              <w:rPr>
+                <w:sz w:val="20"/>
+              </w:rPr>
+              <w:t>System Sequence Diagram</w:t>
+            </w:r>
+          </w:p>
+        </w:tc>
+      </w:tr>
+    </w:tbl>
+    <w:p>
+      <w:pPr>
+        <w:pStyle w:val="Heading1"/>
+      </w:pPr>
+      <w:bookmarkStart w:id="8" w:name="_Toc100009"/>
+      <w:r>
+        <w:t>4. Project Context</w:t>
+      </w:r>
+      <w:bookmarkEnd w:id="8"/>
     </w:p>
     <w:p>
       <w:pPr>
         <w:pStyle w:val="Heading2"/>
       </w:pPr>
-      <w:bookmarkStart w:id="1" w:name="_Toc100014"/>
-      <w:r>
-        <w:t>5.1 Project Work Plan</w:t>
-      </w:r>
-      <w:bookmarkEnd w:id="1"/>
+      <w:bookmarkStart w:id="9" w:name="_Toc100010"/>
+      <w:r>
+        <w:t>4.1 Process Model</w:t>
+      </w:r>
+      <w:bookmarkEnd w:id="9"/>
+    </w:p>
+    <w:p>
+      <w:r>
+        <w:t>A structured software development process is used for the project. The work is organized into requirements and planning, analysis and modeling, design, implementation, testing, and documentation/review. Each phase produces outputs that support the following phase.</w:t>
+      </w:r>
+    </w:p>
+    <w:p>
+      <w:pPr>
+        <w:pStyle w:val="Heading2"/>
+      </w:pPr>
+      <w:bookmarkStart w:id="10" w:name="_Toc100011"/>
+      <w:r>
+        <w:t>4.2 Methods, Tools and Techniques</w:t>
+      </w:r>
+      <w:bookmarkEnd w:id="10"/>
     </w:p>
     <w:tbl>
       <w:tblPr>
@@ -784,6 +1791,425 @@
               <w:rPr>
                 <w:sz w:val="20"/>
               </w:rPr>
+              <w:t>Area</w:t>
+            </w:r>
+          </w:p>
+        </w:tc>
+        <w:tc>
+          <w:tcPr>
+            <w:tcW w:w="4968" w:type="dxa"/>
+            <w:vAlign w:val="center"/>
+          </w:tcPr>
+          <w:p>
+            <w:r>
+              <w:rPr>
+                <w:sz w:val="20"/>
+              </w:rPr>
+              <w:t>Method / Tool</w:t>
+            </w:r>
+          </w:p>
+        </w:tc>
+      </w:tr>
+      <w:tr>
+        <w:tc>
+          <w:tcPr>
+            <w:tcW w:w="4968" w:type="dxa"/>
+            <w:vAlign w:val="center"/>
+          </w:tcPr>
+          <w:p>
+            <w:r>
+              <w:rPr>
+                <w:sz w:val="20"/>
+              </w:rPr>
+              <w:t>Requirements &amp; Analysis</w:t>
+            </w:r>
+          </w:p>
+        </w:tc>
+        <w:tc>
+          <w:tcPr>
+            <w:tcW w:w="4968" w:type="dxa"/>
+            <w:vAlign w:val="center"/>
+          </w:tcPr>
+          <w:p>
+            <w:r>
+              <w:rPr>
+                <w:sz w:val="20"/>
+              </w:rPr>
+              <w:t>SRS, functional/non-functional requirements, use cases</w:t>
+            </w:r>
+          </w:p>
+        </w:tc>
+      </w:tr>
+      <w:tr>
+        <w:tc>
+          <w:tcPr>
+            <w:tcW w:w="4968" w:type="dxa"/>
+            <w:vAlign w:val="center"/>
+          </w:tcPr>
+          <w:p>
+            <w:r>
+              <w:rPr>
+                <w:sz w:val="20"/>
+              </w:rPr>
+              <w:t>System Modeling</w:t>
+            </w:r>
+          </w:p>
+        </w:tc>
+        <w:tc>
+          <w:tcPr>
+            <w:tcW w:w="4968" w:type="dxa"/>
+            <w:vAlign w:val="center"/>
+          </w:tcPr>
+          <w:p>
+            <w:r>
+              <w:rPr>
+                <w:sz w:val="20"/>
+              </w:rPr>
+              <w:t>Use Case Diagram, System Sequence Diagrams, Domain Model, Sequence Diagram</w:t>
+            </w:r>
+          </w:p>
+        </w:tc>
+      </w:tr>
+      <w:tr>
+        <w:tc>
+          <w:tcPr>
+            <w:tcW w:w="4968" w:type="dxa"/>
+            <w:vAlign w:val="center"/>
+          </w:tcPr>
+          <w:p>
+            <w:r>
+              <w:rPr>
+                <w:sz w:val="20"/>
+              </w:rPr>
+              <w:t>Software Design</w:t>
+            </w:r>
+          </w:p>
+        </w:tc>
+        <w:tc>
+          <w:tcPr>
+            <w:tcW w:w="4968" w:type="dxa"/>
+            <w:vAlign w:val="center"/>
+          </w:tcPr>
+          <w:p>
+            <w:r>
+              <w:rPr>
+                <w:sz w:val="20"/>
+              </w:rPr>
+              <w:t>Design Class Diagram and MVC-oriented structure</w:t>
+            </w:r>
+          </w:p>
+        </w:tc>
+      </w:tr>
+      <w:tr>
+        <w:tc>
+          <w:tcPr>
+            <w:tcW w:w="4968" w:type="dxa"/>
+            <w:vAlign w:val="center"/>
+          </w:tcPr>
+          <w:p>
+            <w:r>
+              <w:rPr>
+                <w:sz w:val="20"/>
+              </w:rPr>
+              <w:t>Programming</w:t>
+            </w:r>
+          </w:p>
+        </w:tc>
+        <w:tc>
+          <w:tcPr>
+            <w:tcW w:w="4968" w:type="dxa"/>
+            <w:vAlign w:val="center"/>
+          </w:tcPr>
+          <w:p>
+            <w:r>
+              <w:rPr>
+                <w:sz w:val="20"/>
+              </w:rPr>
+              <w:t>Java / JDK 17+</w:t>
+            </w:r>
+          </w:p>
+        </w:tc>
+      </w:tr>
+      <w:tr>
+        <w:tc>
+          <w:tcPr>
+            <w:tcW w:w="4968" w:type="dxa"/>
+            <w:vAlign w:val="center"/>
+          </w:tcPr>
+          <w:p>
+            <w:r>
+              <w:rPr>
+                <w:sz w:val="20"/>
+              </w:rPr>
+              <w:t>GUI</w:t>
+            </w:r>
+          </w:p>
+        </w:tc>
+        <w:tc>
+          <w:tcPr>
+            <w:tcW w:w="4968" w:type="dxa"/>
+            <w:vAlign w:val="center"/>
+          </w:tcPr>
+          <w:p>
+            <w:r>
+              <w:rPr>
+                <w:sz w:val="20"/>
+              </w:rPr>
+              <w:t>Java Swing and AWT</w:t>
+            </w:r>
+          </w:p>
+        </w:tc>
+      </w:tr>
+      <w:tr>
+        <w:tc>
+          <w:tcPr>
+            <w:tcW w:w="4968" w:type="dxa"/>
+            <w:vAlign w:val="center"/>
+          </w:tcPr>
+          <w:p>
+            <w:r>
+              <w:rPr>
+                <w:sz w:val="20"/>
+              </w:rPr>
+              <w:t>Database</w:t>
+            </w:r>
+          </w:p>
+        </w:tc>
+        <w:tc>
+          <w:tcPr>
+            <w:tcW w:w="4968" w:type="dxa"/>
+            <w:vAlign w:val="center"/>
+          </w:tcPr>
+          <w:p>
+            <w:r>
+              <w:rPr>
+                <w:sz w:val="20"/>
+              </w:rPr>
+              <w:t>MySQL 8.0</w:t>
+            </w:r>
+          </w:p>
+        </w:tc>
+      </w:tr>
+      <w:tr>
+        <w:tc>
+          <w:tcPr>
+            <w:tcW w:w="4968" w:type="dxa"/>
+            <w:vAlign w:val="center"/>
+          </w:tcPr>
+          <w:p>
+            <w:r>
+              <w:rPr>
+                <w:sz w:val="20"/>
+              </w:rPr>
+              <w:t>Connectivity</w:t>
+            </w:r>
+          </w:p>
+        </w:tc>
+        <w:tc>
+          <w:tcPr>
+            <w:tcW w:w="4968" w:type="dxa"/>
+            <w:vAlign w:val="center"/>
+          </w:tcPr>
+          <w:p>
+            <w:r>
+              <w:rPr>
+                <w:sz w:val="20"/>
+              </w:rPr>
+              <w:t>JDBC / mysql-connector-j</w:t>
+            </w:r>
+          </w:p>
+        </w:tc>
+      </w:tr>
+      <w:tr>
+        <w:tc>
+          <w:tcPr>
+            <w:tcW w:w="4968" w:type="dxa"/>
+            <w:vAlign w:val="center"/>
+          </w:tcPr>
+          <w:p>
+            <w:r>
+              <w:rPr>
+                <w:sz w:val="20"/>
+              </w:rPr>
+              <w:t>Development Environment</w:t>
+            </w:r>
+          </w:p>
+        </w:tc>
+        <w:tc>
+          <w:tcPr>
+            <w:tcW w:w="4968" w:type="dxa"/>
+            <w:vAlign w:val="center"/>
+          </w:tcPr>
+          <w:p>
+            <w:r>
+              <w:rPr>
+                <w:sz w:val="20"/>
+              </w:rPr>
+              <w:t>Eclipse IDE</w:t>
+            </w:r>
+          </w:p>
+        </w:tc>
+      </w:tr>
+      <w:tr>
+        <w:tc>
+          <w:tcPr>
+            <w:tcW w:w="4968" w:type="dxa"/>
+            <w:vAlign w:val="center"/>
+          </w:tcPr>
+          <w:p>
+            <w:r>
+              <w:rPr>
+                <w:sz w:val="20"/>
+              </w:rPr>
+              <w:lastRenderedPageBreak/>
+              <w:t>Security</w:t>
+            </w:r>
+          </w:p>
+        </w:tc>
+        <w:tc>
+          <w:tcPr>
+            <w:tcW w:w="4968" w:type="dxa"/>
+            <w:vAlign w:val="center"/>
+          </w:tcPr>
+          <w:p>
+            <w:r>
+              <w:rPr>
+                <w:sz w:val="20"/>
+              </w:rPr>
+              <w:t>Role-based access and prepared statements for SQL injection prevention</w:t>
+            </w:r>
+          </w:p>
+        </w:tc>
+      </w:tr>
+    </w:tbl>
+    <w:p>
+      <w:pPr>
+        <w:pStyle w:val="Heading2"/>
+      </w:pPr>
+      <w:bookmarkStart w:id="11" w:name="_Toc100012"/>
+      <w:r>
+        <w:t>4.3 Product Acceptance Plan</w:t>
+      </w:r>
+      <w:bookmarkEnd w:id="11"/>
+    </w:p>
+    <w:p>
+      <w:r>
+        <w:t>The product will be considered ready for review when the major functions described in the project documentation are implemented and tested. Acceptance will focus on successful login, course management, course registration and dropping, timetable clash detection, timetable display, and report generation.</w:t>
+      </w:r>
+    </w:p>
+    <w:p>
+      <w:pPr>
+        <w:pStyle w:val="ListBullet"/>
+        <w:tabs>
+          <w:tab w:val="num" w:pos="360"/>
+        </w:tabs>
+        <w:ind w:left="360" w:hanging="360"/>
+      </w:pPr>
+      <w:r>
+        <w:t>Valid users can log in according to their role.</w:t>
+      </w:r>
+    </w:p>
+    <w:p>
+      <w:pPr>
+        <w:pStyle w:val="ListBullet"/>
+        <w:tabs>
+          <w:tab w:val="num" w:pos="360"/>
+        </w:tabs>
+        <w:ind w:left="360" w:hanging="360"/>
+      </w:pPr>
+      <w:r>
+        <w:t>Administrators can manage course information.</w:t>
+      </w:r>
+    </w:p>
+    <w:p>
+      <w:pPr>
+        <w:pStyle w:val="ListBullet"/>
+        <w:tabs>
+          <w:tab w:val="num" w:pos="360"/>
+        </w:tabs>
+        <w:ind w:left="360" w:hanging="360"/>
+      </w:pPr>
+      <w:r>
+        <w:t>Students can register for and drop courses.</w:t>
+      </w:r>
+    </w:p>
+    <w:p>
+      <w:pPr>
+        <w:pStyle w:val="ListBullet"/>
+        <w:tabs>
+          <w:tab w:val="num" w:pos="360"/>
+        </w:tabs>
+        <w:ind w:left="360" w:hanging="360"/>
+      </w:pPr>
+      <w:r>
+        <w:t>The system detects and prevents timetable clashes.</w:t>
+      </w:r>
+    </w:p>
+    <w:p>
+      <w:pPr>
+        <w:pStyle w:val="ListBullet"/>
+        <w:tabs>
+          <w:tab w:val="num" w:pos="360"/>
+        </w:tabs>
+        <w:ind w:left="360" w:hanging="360"/>
+      </w:pPr>
+      <w:r>
+        <w:t>A generated timetable can be displayed to the student.</w:t>
+      </w:r>
+    </w:p>
+    <w:p>
+      <w:pPr>
+        <w:pStyle w:val="ListBullet"/>
+        <w:tabs>
+          <w:tab w:val="num" w:pos="360"/>
+        </w:tabs>
+        <w:ind w:left="360" w:hanging="360"/>
+      </w:pPr>
+      <w:r>
+        <w:t>Registration summary reports can be generated.</w:t>
+      </w:r>
+    </w:p>
+    <w:p>
+      <w:pPr>
+        <w:pStyle w:val="Heading1"/>
+      </w:pPr>
+      <w:bookmarkStart w:id="12" w:name="_Toc100013"/>
+      <w:r>
+        <w:t>5. Project Planning</w:t>
+      </w:r>
+      <w:bookmarkEnd w:id="12"/>
+    </w:p>
+    <w:p>
+      <w:pPr>
+        <w:pStyle w:val="Heading2"/>
+      </w:pPr>
+      <w:bookmarkStart w:id="13" w:name="_Toc100014"/>
+      <w:r>
+        <w:t>5.1 Project Work Plan</w:t>
+      </w:r>
+      <w:bookmarkEnd w:id="13"/>
+    </w:p>
+    <w:tbl>
+      <w:tblPr>
+        <w:tblStyle w:val="TableGrid"/>
+        <w:tblW w:w="0" w:type="auto"/>
+        <w:tblLook w:val="04A0" w:firstRow="1" w:lastRow="0" w:firstColumn="1" w:lastColumn="0" w:noHBand="0" w:noVBand="1"/>
+      </w:tblPr>
+      <w:tblGrid>
+        <w:gridCol w:w="4963"/>
+        <w:gridCol w:w="4963"/>
+      </w:tblGrid>
+      <w:tr>
+        <w:tc>
+          <w:tcPr>
+            <w:tcW w:w="4968" w:type="dxa"/>
+            <w:vAlign w:val="center"/>
+          </w:tcPr>
+          <w:p>
+            <w:r>
+              <w:rPr>
+                <w:sz w:val="20"/>
+              </w:rPr>
               <w:t>Work Area</w:t>
             </w:r>
           </w:p>
@@ -1018,11 +2444,16 @@
       <w:pPr>
         <w:pStyle w:val="Heading2"/>
       </w:pPr>
-      <w:bookmarkStart w:id="2" w:name="_Toc100015"/>
+      <w:bookmarkStart w:id="14" w:name="_Toc100015"/>
+    </w:p>
+    <w:p>
+      <w:pPr>
+        <w:pStyle w:val="Heading2"/>
+      </w:pPr>
       <w:r>
         <w:t>5.2 Work Activities</w:t>
       </w:r>
-      <w:bookmarkEnd w:id="2"/>
+      <w:bookmarkEnd w:id="14"/>
     </w:p>
     <w:p>
       <w:pPr>
@@ -1093,6 +2524,7 @@
         <w:ind w:left="360" w:hanging="360"/>
       </w:pPr>
       <w:r>
+        <w:lastRenderedPageBreak/>
         <w:t>Connect the application with MySQL through JDBC.</w:t>
       </w:r>
     </w:p>
@@ -1124,11 +2556,11 @@
       <w:pPr>
         <w:pStyle w:val="Heading2"/>
       </w:pPr>
-      <w:bookmarkStart w:id="3" w:name="_Toc100016"/>
+      <w:bookmarkStart w:id="15" w:name="_Toc100016"/>
       <w:r>
         <w:t>5.3 Schedule Allocation</w:t>
       </w:r>
-      <w:bookmarkEnd w:id="3"/>
+      <w:bookmarkEnd w:id="15"/>
     </w:p>
     <w:tbl>
       <w:tblPr>
@@ -1501,7 +2933,6 @@
               <w:rPr>
                 <w:sz w:val="20"/>
               </w:rPr>
-              <w:lastRenderedPageBreak/>
               <w:t>Documentation &amp; review</w:t>
             </w:r>
           </w:p>
@@ -1554,11 +2985,11 @@
       <w:pPr>
         <w:pStyle w:val="Heading2"/>
       </w:pPr>
-      <w:bookmarkStart w:id="4" w:name="_Toc100017"/>
+      <w:bookmarkStart w:id="16" w:name="_Toc100017"/>
       <w:r>
         <w:t>5.4 Resource Allocation</w:t>
       </w:r>
-      <w:bookmarkEnd w:id="4"/>
+      <w:bookmarkEnd w:id="16"/>
     </w:p>
     <w:tbl>
       <w:tblPr>
@@ -1815,21 +3246,21 @@
       <w:pPr>
         <w:pStyle w:val="Heading1"/>
       </w:pPr>
-      <w:bookmarkStart w:id="5" w:name="_Toc100018"/>
+      <w:bookmarkStart w:id="17" w:name="_Toc100018"/>
       <w:r>
         <w:t>8. Supporting Process Plans</w:t>
       </w:r>
-      <w:bookmarkEnd w:id="5"/>
+      <w:bookmarkEnd w:id="17"/>
     </w:p>
     <w:p>
       <w:pPr>
         <w:pStyle w:val="Heading2"/>
       </w:pPr>
-      <w:bookmarkStart w:id="6" w:name="_Toc100019"/>
+      <w:bookmarkStart w:id="18" w:name="_Toc100019"/>
       <w:r>
         <w:t>8.1 Risk Management</w:t>
       </w:r>
-      <w:bookmarkEnd w:id="6"/>
+      <w:bookmarkEnd w:id="18"/>
     </w:p>
     <w:tbl>
       <w:tblPr>
@@ -1897,6 +3328,7 @@
               <w:rPr>
                 <w:sz w:val="20"/>
               </w:rPr>
+              <w:lastRenderedPageBreak/>
               <w:t>Requirement changes</w:t>
             </w:r>
           </w:p>
@@ -2151,6 +3583,61 @@
         </w:tc>
       </w:tr>
     </w:tbl>
+    <w:p>
+      <w:pPr>
+        <w:pStyle w:val="Heading3"/>
+      </w:pPr>
+      <w:r>
+        <w:t>Risk Monitoring and Review</w:t>
+      </w:r>
+    </w:p>
+    <w:p>
+      <w:pPr/>
+      <w:r>
+        <w:t>The identified risks will be reviewed throughout the project lifecycle. Requirement changes will be checked before implementation, database availability will be monitored, and course scheduling data will be validated to reduce timetable conflicts. Functional testing will be performed after major implementation modules, while project activities will be tracked to identify schedule delays. Access control and prepared SQL statements will be reviewed to reduce security-related risks. Any significant risk or approved change will be documented and communicated to the project team.</w:t>
+      </w:r>
+    </w:p>
+    <w:p>
+      <w:pPr>
+        <w:pStyle w:val="Heading3"/>
+      </w:pPr>
+      <w:r>
+        <w:t>Risk Review Procedure</w:t>
+      </w:r>
+    </w:p>
+    <w:p>
+      <w:pPr>
+        <w:pStyle w:val="ListNumber"/>
+      </w:pPr>
+      <w:r>
+        <w:t>Review the identified risks at the start of major project phases and before significant changes are implemented.</w:t>
+      </w:r>
+    </w:p>
+    <w:p>
+      <w:pPr>
+        <w:pStyle w:val="ListNumber"/>
+      </w:pPr>
+      <w:r>
+        <w:t>Check the effectiveness of the defined mitigation action and update the risk status when conditions change.</w:t>
+      </w:r>
+    </w:p>
+    <w:p>
+      <w:pPr>
+        <w:pStyle w:val="ListNumber"/>
+      </w:pPr>
+      <w:r>
+        <w:t>Escalate risks when their impact increases or when the planned mitigation is not sufficient.</w:t>
+      </w:r>
+    </w:p>
+    <w:p>
+      <w:pPr>
+        <w:pStyle w:val="ListNumber"/>
+      </w:pPr>
+      <w:r>
+        <w:t>Close a risk only after the related condition has been resolved and the required mitigation has been verified.</w:t>
+      </w:r>
+    </w:p>
+    <w:p/>
     <w:p/>
     <w:p/>
     <w:sectPr>
@@ -2168,7 +3655,7 @@
   <w:abstractNum w:abstractNumId="0" w15:restartNumberingAfterBreak="0">
     <w:nsid w:val="FFFFFF88"/>
     <w:multiLevelType w:val="singleLevel"/>
-    <w:tmpl w:val="4DBEFBE2"/>
+    <w:tmpl w:val="36B415A2"/>
     <w:lvl w:ilvl="0">
       <w:start w:val="1"/>
       <w:numFmt w:val="decimal"/>
@@ -2186,7 +3673,7 @@
   <w:abstractNum w:abstractNumId="1" w15:restartNumberingAfterBreak="0">
     <w:nsid w:val="FFFFFF89"/>
     <w:multiLevelType w:val="singleLevel"/>
-    <w:tmpl w:val="684A44AE"/>
+    <w:tmpl w:val="80CA4FE2"/>
     <w:lvl w:ilvl="0">
       <w:start w:val="1"/>
       <w:numFmt w:val="bullet"/>
@@ -2613,7 +4100,7 @@
   <w:style w:type="paragraph" w:default="1" w:styleId="Normal">
     <w:name w:val="Normal"/>
     <w:qFormat/>
-    <w:rsid w:val="00427959"/>
+    <w:rsid w:val="00C7507A"/>
     <w:pPr>
       <w:spacing w:after="200" w:line="276" w:lineRule="auto"/>
     </w:pPr>
@@ -2632,7 +4119,7 @@
     <w:link w:val="Heading1Char"/>
     <w:uiPriority w:val="9"/>
     <w:qFormat/>
-    <w:rsid w:val="00427959"/>
+    <w:rsid w:val="00C7507A"/>
     <w:pPr>
       <w:keepNext/>
       <w:keepLines/>
@@ -2654,7 +4141,7 @@
     <w:uiPriority w:val="9"/>
     <w:unhideWhenUsed/>
     <w:qFormat/>
-    <w:rsid w:val="00427959"/>
+    <w:rsid w:val="00C7507A"/>
     <w:pPr>
       <w:keepNext/>
       <w:keepLines/>
@@ -2677,7 +4164,7 @@
     <w:semiHidden/>
     <w:unhideWhenUsed/>
     <w:qFormat/>
-    <w:rsid w:val="00427959"/>
+    <w:rsid w:val="00C7507A"/>
     <w:pPr>
       <w:keepNext/>
       <w:keepLines/>
@@ -2700,7 +4187,7 @@
     <w:semiHidden/>
     <w:unhideWhenUsed/>
     <w:qFormat/>
-    <w:rsid w:val="00427959"/>
+    <w:rsid w:val="00C7507A"/>
     <w:pPr>
       <w:keepNext/>
       <w:keepLines/>
@@ -2723,7 +4210,7 @@
     <w:semiHidden/>
     <w:unhideWhenUsed/>
     <w:qFormat/>
-    <w:rsid w:val="00427959"/>
+    <w:rsid w:val="00C7507A"/>
     <w:pPr>
       <w:keepNext/>
       <w:keepLines/>
@@ -2744,7 +4231,7 @@
     <w:semiHidden/>
     <w:unhideWhenUsed/>
     <w:qFormat/>
-    <w:rsid w:val="00427959"/>
+    <w:rsid w:val="00C7507A"/>
     <w:pPr>
       <w:keepNext/>
       <w:keepLines/>
@@ -2767,7 +4254,7 @@
     <w:semiHidden/>
     <w:unhideWhenUsed/>
     <w:qFormat/>
-    <w:rsid w:val="00427959"/>
+    <w:rsid w:val="00C7507A"/>
     <w:pPr>
       <w:keepNext/>
       <w:keepLines/>
@@ -2788,7 +4275,7 @@
     <w:semiHidden/>
     <w:unhideWhenUsed/>
     <w:qFormat/>
-    <w:rsid w:val="00427959"/>
+    <w:rsid w:val="00C7507A"/>
     <w:pPr>
       <w:keepNext/>
       <w:keepLines/>
@@ -2811,7 +4298,7 @@
     <w:semiHidden/>
     <w:unhideWhenUsed/>
     <w:qFormat/>
-    <w:rsid w:val="00427959"/>
+    <w:rsid w:val="00C7507A"/>
     <w:pPr>
       <w:keepNext/>
       <w:keepLines/>
@@ -2855,7 +4342,7 @@
     <w:basedOn w:val="DefaultParagraphFont"/>
     <w:link w:val="Heading1"/>
     <w:uiPriority w:val="9"/>
-    <w:rsid w:val="00427959"/>
+    <w:rsid w:val="00C7507A"/>
     <w:rPr>
       <w:rFonts w:asciiTheme="majorHAnsi" w:eastAsiaTheme="majorEastAsia" w:hAnsiTheme="majorHAnsi" w:cstheme="majorBidi"/>
       <w:color w:val="0F4761" w:themeColor="accent1" w:themeShade="BF"/>
@@ -2868,7 +4355,7 @@
     <w:basedOn w:val="DefaultParagraphFont"/>
     <w:link w:val="Heading2"/>
     <w:uiPriority w:val="9"/>
-    <w:rsid w:val="00427959"/>
+    <w:rsid w:val="00C7507A"/>
     <w:rPr>
       <w:rFonts w:asciiTheme="majorHAnsi" w:eastAsiaTheme="majorEastAsia" w:hAnsiTheme="majorHAnsi" w:cstheme="majorBidi"/>
       <w:color w:val="0F4761" w:themeColor="accent1" w:themeShade="BF"/>
@@ -2882,7 +4369,7 @@
     <w:link w:val="Heading3"/>
     <w:uiPriority w:val="9"/>
     <w:semiHidden/>
-    <w:rsid w:val="00427959"/>
+    <w:rsid w:val="00C7507A"/>
     <w:rPr>
       <w:rFonts w:eastAsiaTheme="majorEastAsia" w:cstheme="majorBidi"/>
       <w:color w:val="0F4761" w:themeColor="accent1" w:themeShade="BF"/>
@@ -2896,7 +4383,7 @@
     <w:link w:val="Heading4"/>
     <w:uiPriority w:val="9"/>
     <w:semiHidden/>
-    <w:rsid w:val="00427959"/>
+    <w:rsid w:val="00C7507A"/>
     <w:rPr>
       <w:rFonts w:eastAsiaTheme="majorEastAsia" w:cstheme="majorBidi"/>
       <w:i/>
@@ -2910,7 +4397,7 @@
     <w:link w:val="Heading5"/>
     <w:uiPriority w:val="9"/>
     <w:semiHidden/>
-    <w:rsid w:val="00427959"/>
+    <w:rsid w:val="00C7507A"/>
     <w:rPr>
       <w:rFonts w:eastAsiaTheme="majorEastAsia" w:cstheme="majorBidi"/>
       <w:color w:val="0F4761" w:themeColor="accent1" w:themeShade="BF"/>
@@ -2922,7 +4409,7 @@
     <w:link w:val="Heading6"/>
     <w:uiPriority w:val="9"/>
     <w:semiHidden/>
-    <w:rsid w:val="00427959"/>
+    <w:rsid w:val="00C7507A"/>
     <w:rPr>
       <w:rFonts w:eastAsiaTheme="majorEastAsia" w:cstheme="majorBidi"/>
       <w:i/>
@@ -2936,7 +4423,7 @@
     <w:link w:val="Heading7"/>
     <w:uiPriority w:val="9"/>
     <w:semiHidden/>
-    <w:rsid w:val="00427959"/>
+    <w:rsid w:val="00C7507A"/>
     <w:rPr>
       <w:rFonts w:eastAsiaTheme="majorEastAsia" w:cstheme="majorBidi"/>
       <w:color w:val="595959" w:themeColor="text1" w:themeTint="A6"/>
@@ -2948,7 +4435,7 @@
     <w:link w:val="Heading8"/>
     <w:uiPriority w:val="9"/>
     <w:semiHidden/>
-    <w:rsid w:val="00427959"/>
+    <w:rsid w:val="00C7507A"/>
     <w:rPr>
       <w:rFonts w:eastAsiaTheme="majorEastAsia" w:cstheme="majorBidi"/>
       <w:i/>
@@ -2962,7 +4449,7 @@
     <w:link w:val="Heading9"/>
     <w:uiPriority w:val="9"/>
     <w:semiHidden/>
-    <w:rsid w:val="00427959"/>
+    <w:rsid w:val="00C7507A"/>
     <w:rPr>
       <w:rFonts w:eastAsiaTheme="majorEastAsia" w:cstheme="majorBidi"/>
       <w:color w:val="272727" w:themeColor="text1" w:themeTint="D8"/>
@@ -2975,7 +4462,7 @@
     <w:link w:val="TitleChar"/>
     <w:uiPriority w:val="10"/>
     <w:qFormat/>
-    <w:rsid w:val="00427959"/>
+    <w:rsid w:val="00C7507A"/>
     <w:pPr>
       <w:spacing w:after="80" w:line="240" w:lineRule="auto"/>
       <w:contextualSpacing/>
@@ -2993,7 +4480,7 @@
     <w:basedOn w:val="DefaultParagraphFont"/>
     <w:link w:val="Title"/>
     <w:uiPriority w:val="10"/>
-    <w:rsid w:val="00427959"/>
+    <w:rsid w:val="00C7507A"/>
     <w:rPr>
       <w:rFonts w:asciiTheme="majorHAnsi" w:eastAsiaTheme="majorEastAsia" w:hAnsiTheme="majorHAnsi" w:cstheme="majorBidi"/>
       <w:spacing w:val="-10"/>
@@ -3009,7 +4496,7 @@
     <w:link w:val="SubtitleChar"/>
     <w:uiPriority w:val="11"/>
     <w:qFormat/>
-    <w:rsid w:val="00427959"/>
+    <w:rsid w:val="00C7507A"/>
     <w:pPr>
       <w:numPr>
         <w:ilvl w:val="1"/>
@@ -3028,7 +4515,7 @@
     <w:basedOn w:val="DefaultParagraphFont"/>
     <w:link w:val="Subtitle"/>
     <w:uiPriority w:val="11"/>
-    <w:rsid w:val="00427959"/>
+    <w:rsid w:val="00C7507A"/>
     <w:rPr>
       <w:rFonts w:eastAsiaTheme="majorEastAsia" w:cstheme="majorBidi"/>
       <w:color w:val="595959" w:themeColor="text1" w:themeTint="A6"/>
@@ -3044,7 +4531,7 @@
     <w:link w:val="QuoteChar"/>
     <w:uiPriority w:val="29"/>
     <w:qFormat/>
-    <w:rsid w:val="00427959"/>
+    <w:rsid w:val="00C7507A"/>
     <w:pPr>
       <w:spacing w:before="160"/>
       <w:jc w:val="center"/>
@@ -3060,7 +4547,7 @@
     <w:basedOn w:val="DefaultParagraphFont"/>
     <w:link w:val="Quote"/>
     <w:uiPriority w:val="29"/>
-    <w:rsid w:val="00427959"/>
+    <w:rsid w:val="00C7507A"/>
     <w:rPr>
       <w:i/>
       <w:iCs/>
@@ -3072,7 +4559,7 @@
     <w:basedOn w:val="Normal"/>
     <w:uiPriority w:val="34"/>
     <w:qFormat/>
-    <w:rsid w:val="00427959"/>
+    <w:rsid w:val="00C7507A"/>
     <w:pPr>
       <w:ind w:left="720"/>
       <w:contextualSpacing/>
@@ -3083,7 +4570,7 @@
     <w:basedOn w:val="DefaultParagraphFont"/>
     <w:uiPriority w:val="21"/>
     <w:qFormat/>
-    <w:rsid w:val="00427959"/>
+    <w:rsid w:val="00C7507A"/>
     <w:rPr>
       <w:i/>
       <w:iCs/>
@@ -3097,7 +4584,7 @@
     <w:link w:val="IntenseQuoteChar"/>
     <w:uiPriority w:val="30"/>
     <w:qFormat/>
-    <w:rsid w:val="00427959"/>
+    <w:rsid w:val="00C7507A"/>
     <w:pPr>
       <w:pBdr>
         <w:top w:val="single" w:sz="4" w:space="10" w:color="0F4761" w:themeColor="accent1" w:themeShade="BF"/>
@@ -3118,7 +4605,7 @@
     <w:basedOn w:val="DefaultParagraphFont"/>
     <w:link w:val="IntenseQuote"/>
     <w:uiPriority w:val="30"/>
-    <w:rsid w:val="00427959"/>
+    <w:rsid w:val="00C7507A"/>
     <w:rPr>
       <w:i/>
       <w:iCs/>
@@ -3130,7 +4617,7 @@
     <w:basedOn w:val="DefaultParagraphFont"/>
     <w:uiPriority w:val="32"/>
     <w:qFormat/>
-    <w:rsid w:val="00427959"/>
+    <w:rsid w:val="00C7507A"/>
     <w:rPr>
       <w:b/>
       <w:bCs/>
@@ -3144,7 +4631,7 @@
     <w:basedOn w:val="Normal"/>
     <w:uiPriority w:val="99"/>
     <w:unhideWhenUsed/>
-    <w:rsid w:val="00427959"/>
+    <w:rsid w:val="00C7507A"/>
     <w:pPr>
       <w:numPr>
         <w:numId w:val="1"/>
@@ -3161,7 +4648,7 @@
     <w:basedOn w:val="Normal"/>
     <w:uiPriority w:val="99"/>
     <w:unhideWhenUsed/>
-    <w:rsid w:val="00427959"/>
+    <w:rsid w:val="00C7507A"/>
     <w:pPr>
       <w:numPr>
         <w:numId w:val="2"/>
@@ -3177,7 +4664,7 @@
     <w:name w:val="Table Grid"/>
     <w:basedOn w:val="TableNormal"/>
     <w:uiPriority w:val="59"/>
-    <w:rsid w:val="00427959"/>
+    <w:rsid w:val="00C7507A"/>
     <w:pPr>
       <w:spacing w:after="0" w:line="240" w:lineRule="auto"/>
     </w:pPr>
@@ -3206,6 +4693,7 @@
     <w:autoRedefine/>
     <w:uiPriority w:val="39"/>
     <w:unhideWhenUsed/>
+    <w:rsid w:val="00C7507A"/>
     <w:pPr>
       <w:tabs>
         <w:tab w:val="right" w:leader="dot" w:pos="9926"/>
@@ -3223,6 +4711,7 @@
     <w:autoRedefine/>
     <w:uiPriority w:val="39"/>
     <w:unhideWhenUsed/>
+    <w:rsid w:val="00C7507A"/>
     <w:pPr>
       <w:tabs>
         <w:tab w:val="right" w:leader="dot" w:pos="9926"/>

</xml_diff>